<commit_message>
keep original table format in black and white
</commit_message>
<xml_diff>
--- a/experiment5_1032232006_amey_tarmale_99acres.docx
+++ b/experiment5_1032232006_amey_tarmale_99acres.docx
@@ -143,96 +143,91 @@
         <w:tblLayout w:type="fixed"/>
       </w:tblPr>
       <w:tblGrid>
-        <w:gridCol w:w="460"/>
-        <w:gridCol w:w="1655"/>
-        <w:gridCol w:w="4392"/>
-        <w:gridCol w:w="792"/>
-        <w:gridCol w:w="3024"/>
+        <w:gridCol w:w="576"/>
+        <w:gridCol w:w="2736"/>
+        <w:gridCol w:w="3528"/>
+        <w:gridCol w:w="1080"/>
+        <w:gridCol w:w="2404"/>
       </w:tblGrid>
       <w:tr>
         <w:tc>
           <w:tcPr>
-            <w:tcW w:type="dxa" w:w="461"/>
-            <w:vAlign w:val="center"/>
-            <w:shd w:val="clear" w:color="auto" w:fill="D9E2DC"/>
-          </w:tcPr>
-          <w:p>
-            <w:pPr>
-              <w:spacing w:before="0" w:after="0" w:line="240" w:lineRule="auto"/>
-              <w:jc w:val="center"/>
-            </w:pPr>
-            <w:r>
-              <w:rPr>
-                <w:b/>
-                <w:sz w:val="16"/>
-              </w:rPr>
-              <w:t>No.</w:t>
-            </w:r>
-          </w:p>
-        </w:tc>
-        <w:tc>
-          <w:tcPr>
-            <w:tcW w:type="dxa" w:w="1656"/>
-            <w:vAlign w:val="center"/>
-            <w:shd w:val="clear" w:color="auto" w:fill="D9E2DC"/>
-          </w:tcPr>
-          <w:p>
-            <w:pPr>
-              <w:spacing w:before="0" w:after="0" w:line="240" w:lineRule="auto"/>
-            </w:pPr>
-            <w:r>
-              <w:rPr>
-                <w:b/>
-                <w:sz w:val="16"/>
-              </w:rPr>
-              <w:t>Heuristic</w:t>
-            </w:r>
-          </w:p>
-        </w:tc>
-        <w:tc>
-          <w:tcPr>
-            <w:tcW w:type="dxa" w:w="4392"/>
-            <w:vAlign w:val="center"/>
-            <w:shd w:val="clear" w:color="auto" w:fill="D9E2DC"/>
-          </w:tcPr>
-          <w:p>
-            <w:pPr>
-              <w:spacing w:before="0" w:after="0" w:line="240" w:lineRule="auto"/>
-            </w:pPr>
-            <w:r>
-              <w:rPr>
-                <w:b/>
-                <w:sz w:val="16"/>
-              </w:rPr>
-              <w:t>Violation (if any)</w:t>
-            </w:r>
-          </w:p>
-        </w:tc>
-        <w:tc>
-          <w:tcPr>
-            <w:tcW w:type="dxa" w:w="792"/>
-            <w:vAlign w:val="center"/>
-            <w:shd w:val="clear" w:color="auto" w:fill="D9E2DC"/>
-          </w:tcPr>
-          <w:p>
-            <w:pPr>
-              <w:spacing w:before="0" w:after="0" w:line="240" w:lineRule="auto"/>
-              <w:jc w:val="center"/>
-            </w:pPr>
-            <w:r>
-              <w:rPr>
-                <w:b/>
-                <w:sz w:val="16"/>
-              </w:rPr>
-              <w:t>Severity (0-5)</w:t>
-            </w:r>
-          </w:p>
-        </w:tc>
-        <w:tc>
-          <w:tcPr>
-            <w:tcW w:type="dxa" w:w="3024"/>
-            <w:vAlign w:val="center"/>
-            <w:shd w:val="clear" w:color="auto" w:fill="D9E2DC"/>
+            <w:tcW w:type="dxa" w:w="576"/>
+            <w:vAlign w:val="center"/>
+          </w:tcPr>
+          <w:p>
+            <w:pPr>
+              <w:spacing w:before="0" w:after="0" w:line="240" w:lineRule="auto"/>
+              <w:jc w:val="center"/>
+            </w:pPr>
+            <w:r>
+              <w:rPr>
+                <w:b/>
+                <w:sz w:val="16"/>
+              </w:rPr>
+              <w:t>S.No.</w:t>
+            </w:r>
+          </w:p>
+        </w:tc>
+        <w:tc>
+          <w:tcPr>
+            <w:tcW w:type="dxa" w:w="2736"/>
+            <w:vAlign w:val="center"/>
+          </w:tcPr>
+          <w:p>
+            <w:pPr>
+              <w:spacing w:before="0" w:after="0" w:line="240" w:lineRule="auto"/>
+            </w:pPr>
+            <w:r>
+              <w:rPr>
+                <w:b/>
+                <w:sz w:val="16"/>
+              </w:rPr>
+              <w:t>Heuristic Evaluation Parameter</w:t>
+            </w:r>
+          </w:p>
+        </w:tc>
+        <w:tc>
+          <w:tcPr>
+            <w:tcW w:type="dxa" w:w="3528"/>
+            <w:vAlign w:val="center"/>
+          </w:tcPr>
+          <w:p>
+            <w:pPr>
+              <w:spacing w:before="0" w:after="0" w:line="240" w:lineRule="auto"/>
+            </w:pPr>
+            <w:r>
+              <w:rPr>
+                <w:b/>
+                <w:sz w:val="16"/>
+              </w:rPr>
+              <w:t>Mention Violation if any</w:t>
+            </w:r>
+          </w:p>
+        </w:tc>
+        <w:tc>
+          <w:tcPr>
+            <w:tcW w:type="dxa" w:w="1080"/>
+            <w:vAlign w:val="center"/>
+          </w:tcPr>
+          <w:p>
+            <w:pPr>
+              <w:spacing w:before="0" w:after="0" w:line="240" w:lineRule="auto"/>
+              <w:jc w:val="center"/>
+            </w:pPr>
+            <w:r>
+              <w:rPr>
+                <w:b/>
+                <w:sz w:val="16"/>
+              </w:rPr>
+              <w:t>Severity  0-5 (0- minimum and 5 is maximium)</w:t>
+            </w:r>
+          </w:p>
+        </w:tc>
+        <w:tc>
+          <w:tcPr>
+            <w:tcW w:type="dxa" w:w="2405"/>
+            <w:vAlign w:val="center"/>
           </w:tcPr>
           <w:p>
             <w:pPr>
@@ -251,7 +246,7 @@
       <w:tr>
         <w:tc>
           <w:tcPr>
-            <w:tcW w:type="dxa" w:w="461"/>
+            <w:tcW w:type="dxa" w:w="576"/>
             <w:vAlign w:val="center"/>
           </w:tcPr>
           <w:p>
@@ -270,25 +265,25 @@
         </w:tc>
         <w:tc>
           <w:tcPr>
-            <w:tcW w:type="dxa" w:w="1656"/>
-            <w:vAlign w:val="center"/>
-          </w:tcPr>
-          <w:p>
-            <w:pPr>
-              <w:spacing w:before="0" w:after="0" w:line="240" w:lineRule="auto"/>
-            </w:pPr>
-            <w:r>
-              <w:rPr>
-                <w:b w:val="0"/>
-                <w:sz w:val="16"/>
-              </w:rPr>
-              <w:t>User Control</w:t>
-            </w:r>
-          </w:p>
-        </w:tc>
-        <w:tc>
-          <w:tcPr>
-            <w:tcW w:type="dxa" w:w="4392"/>
+            <w:tcW w:type="dxa" w:w="2736"/>
+            <w:vAlign w:val="center"/>
+          </w:tcPr>
+          <w:p>
+            <w:pPr>
+              <w:spacing w:before="0" w:after="0" w:line="240" w:lineRule="auto"/>
+            </w:pPr>
+            <w:r>
+              <w:rPr>
+                <w:b w:val="0"/>
+                <w:sz w:val="16"/>
+              </w:rPr>
+              <w:t>User Control: Interface will allow the user to perceive that they are in control</w:t>
+            </w:r>
+          </w:p>
+        </w:tc>
+        <w:tc>
+          <w:tcPr>
+            <w:tcW w:type="dxa" w:w="3528"/>
             <w:vAlign w:val="center"/>
           </w:tcPr>
           <w:p>
@@ -306,7 +301,7 @@
         </w:tc>
         <w:tc>
           <w:tcPr>
-            <w:tcW w:type="dxa" w:w="792"/>
+            <w:tcW w:type="dxa" w:w="1080"/>
             <w:vAlign w:val="center"/>
           </w:tcPr>
           <w:p>
@@ -325,7 +320,7 @@
         </w:tc>
         <w:tc>
           <w:tcPr>
-            <w:tcW w:type="dxa" w:w="3024"/>
+            <w:tcW w:type="dxa" w:w="2405"/>
             <w:vAlign w:val="center"/>
           </w:tcPr>
           <w:p>
@@ -345,7 +340,7 @@
       <w:tr>
         <w:tc>
           <w:tcPr>
-            <w:tcW w:type="dxa" w:w="461"/>
+            <w:tcW w:type="dxa" w:w="576"/>
             <w:vAlign w:val="center"/>
           </w:tcPr>
           <w:p>
@@ -364,25 +359,25 @@
         </w:tc>
         <w:tc>
           <w:tcPr>
-            <w:tcW w:type="dxa" w:w="1656"/>
-            <w:vAlign w:val="center"/>
-          </w:tcPr>
-          <w:p>
-            <w:pPr>
-              <w:spacing w:before="0" w:after="0" w:line="240" w:lineRule="auto"/>
-            </w:pPr>
-            <w:r>
-              <w:rPr>
-                <w:b w:val="0"/>
-                <w:sz w:val="16"/>
-              </w:rPr>
-              <w:t>Human Limitations</w:t>
-            </w:r>
-          </w:p>
-        </w:tc>
-        <w:tc>
-          <w:tcPr>
-            <w:tcW w:type="dxa" w:w="4392"/>
+            <w:tcW w:type="dxa" w:w="2736"/>
+            <w:vAlign w:val="center"/>
+          </w:tcPr>
+          <w:p>
+            <w:pPr>
+              <w:spacing w:before="0" w:after="0" w:line="240" w:lineRule="auto"/>
+            </w:pPr>
+            <w:r>
+              <w:rPr>
+                <w:b w:val="0"/>
+                <w:sz w:val="16"/>
+              </w:rPr>
+              <w:t>Human Limitations: Interface will not overload the users cognitive, auditory and motor skills</w:t>
+            </w:r>
+          </w:p>
+        </w:tc>
+        <w:tc>
+          <w:tcPr>
+            <w:tcW w:type="dxa" w:w="3528"/>
             <w:vAlign w:val="center"/>
           </w:tcPr>
           <w:p>
@@ -400,7 +395,7 @@
         </w:tc>
         <w:tc>
           <w:tcPr>
-            <w:tcW w:type="dxa" w:w="792"/>
+            <w:tcW w:type="dxa" w:w="1080"/>
             <w:vAlign w:val="center"/>
           </w:tcPr>
           <w:p>
@@ -419,7 +414,7 @@
         </w:tc>
         <w:tc>
           <w:tcPr>
-            <w:tcW w:type="dxa" w:w="3024"/>
+            <w:tcW w:type="dxa" w:w="2405"/>
             <w:vAlign w:val="center"/>
           </w:tcPr>
           <w:p>
@@ -439,7 +434,7 @@
       <w:tr>
         <w:tc>
           <w:tcPr>
-            <w:tcW w:type="dxa" w:w="461"/>
+            <w:tcW w:type="dxa" w:w="576"/>
             <w:vAlign w:val="center"/>
           </w:tcPr>
           <w:p>
@@ -458,25 +453,25 @@
         </w:tc>
         <w:tc>
           <w:tcPr>
-            <w:tcW w:type="dxa" w:w="1656"/>
-            <w:vAlign w:val="center"/>
-          </w:tcPr>
-          <w:p>
-            <w:pPr>
-              <w:spacing w:before="0" w:after="0" w:line="240" w:lineRule="auto"/>
-            </w:pPr>
-            <w:r>
-              <w:rPr>
-                <w:b w:val="0"/>
-                <w:sz w:val="16"/>
-              </w:rPr>
-              <w:t>Accommodation</w:t>
-            </w:r>
-          </w:p>
-        </w:tc>
-        <w:tc>
-          <w:tcPr>
-            <w:tcW w:type="dxa" w:w="4392"/>
+            <w:tcW w:type="dxa" w:w="2736"/>
+            <w:vAlign w:val="center"/>
+          </w:tcPr>
+          <w:p>
+            <w:pPr>
+              <w:spacing w:before="0" w:after="0" w:line="240" w:lineRule="auto"/>
+            </w:pPr>
+            <w:r>
+              <w:rPr>
+                <w:b w:val="0"/>
+                <w:sz w:val="16"/>
+              </w:rPr>
+              <w:t>Accommodation: The interface will fit the way each user group works and thinks (personas)</w:t>
+            </w:r>
+          </w:p>
+        </w:tc>
+        <w:tc>
+          <w:tcPr>
+            <w:tcW w:type="dxa" w:w="3528"/>
             <w:vAlign w:val="center"/>
           </w:tcPr>
           <w:p>
@@ -494,7 +489,7 @@
         </w:tc>
         <w:tc>
           <w:tcPr>
-            <w:tcW w:type="dxa" w:w="792"/>
+            <w:tcW w:type="dxa" w:w="1080"/>
             <w:vAlign w:val="center"/>
           </w:tcPr>
           <w:p>
@@ -513,7 +508,7 @@
         </w:tc>
         <w:tc>
           <w:tcPr>
-            <w:tcW w:type="dxa" w:w="3024"/>
+            <w:tcW w:type="dxa" w:w="2405"/>
             <w:vAlign w:val="center"/>
           </w:tcPr>
           <w:p>
@@ -533,7 +528,7 @@
       <w:tr>
         <w:tc>
           <w:tcPr>
-            <w:tcW w:type="dxa" w:w="461"/>
+            <w:tcW w:type="dxa" w:w="576"/>
             <w:vAlign w:val="center"/>
           </w:tcPr>
           <w:p>
@@ -552,25 +547,25 @@
         </w:tc>
         <w:tc>
           <w:tcPr>
-            <w:tcW w:type="dxa" w:w="1656"/>
-            <w:vAlign w:val="center"/>
-          </w:tcPr>
-          <w:p>
-            <w:pPr>
-              <w:spacing w:before="0" w:after="0" w:line="240" w:lineRule="auto"/>
-            </w:pPr>
-            <w:r>
-              <w:rPr>
-                <w:b w:val="0"/>
-                <w:sz w:val="16"/>
-              </w:rPr>
-              <w:t>Linguistic Clarity</w:t>
-            </w:r>
-          </w:p>
-        </w:tc>
-        <w:tc>
-          <w:tcPr>
-            <w:tcW w:type="dxa" w:w="4392"/>
+            <w:tcW w:type="dxa" w:w="2736"/>
+            <w:vAlign w:val="center"/>
+          </w:tcPr>
+          <w:p>
+            <w:pPr>
+              <w:spacing w:before="0" w:after="0" w:line="240" w:lineRule="auto"/>
+            </w:pPr>
+            <w:r>
+              <w:rPr>
+                <w:b w:val="0"/>
+                <w:sz w:val="16"/>
+              </w:rPr>
+              <w:t>Linguistic Clarity: Interface will communicate as efficiently as possible</w:t>
+            </w:r>
+          </w:p>
+        </w:tc>
+        <w:tc>
+          <w:tcPr>
+            <w:tcW w:type="dxa" w:w="3528"/>
             <w:vAlign w:val="center"/>
           </w:tcPr>
           <w:p>
@@ -588,7 +583,7 @@
         </w:tc>
         <w:tc>
           <w:tcPr>
-            <w:tcW w:type="dxa" w:w="792"/>
+            <w:tcW w:type="dxa" w:w="1080"/>
             <w:vAlign w:val="center"/>
           </w:tcPr>
           <w:p>
@@ -607,7 +602,7 @@
         </w:tc>
         <w:tc>
           <w:tcPr>
-            <w:tcW w:type="dxa" w:w="3024"/>
+            <w:tcW w:type="dxa" w:w="2405"/>
             <w:vAlign w:val="center"/>
           </w:tcPr>
           <w:p>
@@ -627,7 +622,7 @@
       <w:tr>
         <w:tc>
           <w:tcPr>
-            <w:tcW w:type="dxa" w:w="461"/>
+            <w:tcW w:type="dxa" w:w="576"/>
             <w:vAlign w:val="center"/>
           </w:tcPr>
           <w:p>
@@ -646,25 +641,25 @@
         </w:tc>
         <w:tc>
           <w:tcPr>
-            <w:tcW w:type="dxa" w:w="1656"/>
-            <w:vAlign w:val="center"/>
-          </w:tcPr>
-          <w:p>
-            <w:pPr>
-              <w:spacing w:before="0" w:after="0" w:line="240" w:lineRule="auto"/>
-            </w:pPr>
-            <w:r>
-              <w:rPr>
-                <w:b w:val="0"/>
-                <w:sz w:val="16"/>
-              </w:rPr>
-              <w:t>Aesthetic Integrity</w:t>
-            </w:r>
-          </w:p>
-        </w:tc>
-        <w:tc>
-          <w:tcPr>
-            <w:tcW w:type="dxa" w:w="4392"/>
+            <w:tcW w:type="dxa" w:w="2736"/>
+            <w:vAlign w:val="center"/>
+          </w:tcPr>
+          <w:p>
+            <w:pPr>
+              <w:spacing w:before="0" w:after="0" w:line="240" w:lineRule="auto"/>
+            </w:pPr>
+            <w:r>
+              <w:rPr>
+                <w:b w:val="0"/>
+                <w:sz w:val="16"/>
+              </w:rPr>
+              <w:t>Aesthetic Integrity :The interface will have an attractive and appropriate design</w:t>
+            </w:r>
+          </w:p>
+        </w:tc>
+        <w:tc>
+          <w:tcPr>
+            <w:tcW w:type="dxa" w:w="3528"/>
             <w:vAlign w:val="center"/>
           </w:tcPr>
           <w:p>
@@ -682,7 +677,7 @@
         </w:tc>
         <w:tc>
           <w:tcPr>
-            <w:tcW w:type="dxa" w:w="792"/>
+            <w:tcW w:type="dxa" w:w="1080"/>
             <w:vAlign w:val="center"/>
           </w:tcPr>
           <w:p>
@@ -701,7 +696,7 @@
         </w:tc>
         <w:tc>
           <w:tcPr>
-            <w:tcW w:type="dxa" w:w="3024"/>
+            <w:tcW w:type="dxa" w:w="2405"/>
             <w:vAlign w:val="center"/>
           </w:tcPr>
           <w:p>
@@ -721,7 +716,7 @@
       <w:tr>
         <w:tc>
           <w:tcPr>
-            <w:tcW w:type="dxa" w:w="461"/>
+            <w:tcW w:type="dxa" w:w="576"/>
             <w:vAlign w:val="center"/>
           </w:tcPr>
           <w:p>
@@ -740,25 +735,25 @@
         </w:tc>
         <w:tc>
           <w:tcPr>
-            <w:tcW w:type="dxa" w:w="1656"/>
-            <w:vAlign w:val="center"/>
-          </w:tcPr>
-          <w:p>
-            <w:pPr>
-              <w:spacing w:before="0" w:after="0" w:line="240" w:lineRule="auto"/>
-            </w:pPr>
-            <w:r>
-              <w:rPr>
-                <w:b w:val="0"/>
-                <w:sz w:val="16"/>
-              </w:rPr>
-              <w:t>Simplicity</w:t>
-            </w:r>
-          </w:p>
-        </w:tc>
-        <w:tc>
-          <w:tcPr>
-            <w:tcW w:type="dxa" w:w="4392"/>
+            <w:tcW w:type="dxa" w:w="2736"/>
+            <w:vAlign w:val="center"/>
+          </w:tcPr>
+          <w:p>
+            <w:pPr>
+              <w:spacing w:before="0" w:after="0" w:line="240" w:lineRule="auto"/>
+            </w:pPr>
+            <w:r>
+              <w:rPr>
+                <w:b w:val="0"/>
+                <w:sz w:val="16"/>
+              </w:rPr>
+              <w:t>Simplicity: The interface will have a simple design</w:t>
+            </w:r>
+          </w:p>
+        </w:tc>
+        <w:tc>
+          <w:tcPr>
+            <w:tcW w:type="dxa" w:w="3528"/>
             <w:vAlign w:val="center"/>
           </w:tcPr>
           <w:p>
@@ -776,7 +771,7 @@
         </w:tc>
         <w:tc>
           <w:tcPr>
-            <w:tcW w:type="dxa" w:w="792"/>
+            <w:tcW w:type="dxa" w:w="1080"/>
             <w:vAlign w:val="center"/>
           </w:tcPr>
           <w:p>
@@ -795,7 +790,7 @@
         </w:tc>
         <w:tc>
           <w:tcPr>
-            <w:tcW w:type="dxa" w:w="3024"/>
+            <w:tcW w:type="dxa" w:w="2405"/>
             <w:vAlign w:val="center"/>
           </w:tcPr>
           <w:p>
@@ -815,7 +810,7 @@
       <w:tr>
         <w:tc>
           <w:tcPr>
-            <w:tcW w:type="dxa" w:w="461"/>
+            <w:tcW w:type="dxa" w:w="576"/>
             <w:vAlign w:val="center"/>
           </w:tcPr>
           <w:p>
@@ -834,25 +829,25 @@
         </w:tc>
         <w:tc>
           <w:tcPr>
-            <w:tcW w:type="dxa" w:w="1656"/>
-            <w:vAlign w:val="center"/>
-          </w:tcPr>
-          <w:p>
-            <w:pPr>
-              <w:spacing w:before="0" w:after="0" w:line="240" w:lineRule="auto"/>
-            </w:pPr>
-            <w:r>
-              <w:rPr>
-                <w:b w:val="0"/>
-                <w:sz w:val="16"/>
-              </w:rPr>
-              <w:t>Predictability</w:t>
-            </w:r>
-          </w:p>
-        </w:tc>
-        <w:tc>
-          <w:tcPr>
-            <w:tcW w:type="dxa" w:w="4392"/>
+            <w:tcW w:type="dxa" w:w="2736"/>
+            <w:vAlign w:val="center"/>
+          </w:tcPr>
+          <w:p>
+            <w:pPr>
+              <w:spacing w:before="0" w:after="0" w:line="240" w:lineRule="auto"/>
+            </w:pPr>
+            <w:r>
+              <w:rPr>
+                <w:b w:val="0"/>
+                <w:sz w:val="16"/>
+              </w:rPr>
+              <w:t>Predictability :The interface will behave in such a manner that the user can accurately predict what will happen next</w:t>
+            </w:r>
+          </w:p>
+        </w:tc>
+        <w:tc>
+          <w:tcPr>
+            <w:tcW w:type="dxa" w:w="3528"/>
             <w:vAlign w:val="center"/>
           </w:tcPr>
           <w:p>
@@ -870,7 +865,7 @@
         </w:tc>
         <w:tc>
           <w:tcPr>
-            <w:tcW w:type="dxa" w:w="792"/>
+            <w:tcW w:type="dxa" w:w="1080"/>
             <w:vAlign w:val="center"/>
           </w:tcPr>
           <w:p>
@@ -889,7 +884,7 @@
         </w:tc>
         <w:tc>
           <w:tcPr>
-            <w:tcW w:type="dxa" w:w="3024"/>
+            <w:tcW w:type="dxa" w:w="2405"/>
             <w:vAlign w:val="center"/>
           </w:tcPr>
           <w:p>
@@ -909,7 +904,7 @@
       <w:tr>
         <w:tc>
           <w:tcPr>
-            <w:tcW w:type="dxa" w:w="461"/>
+            <w:tcW w:type="dxa" w:w="576"/>
             <w:vAlign w:val="center"/>
           </w:tcPr>
           <w:p>
@@ -928,25 +923,25 @@
         </w:tc>
         <w:tc>
           <w:tcPr>
-            <w:tcW w:type="dxa" w:w="1656"/>
-            <w:vAlign w:val="center"/>
-          </w:tcPr>
-          <w:p>
-            <w:pPr>
-              <w:spacing w:before="0" w:after="0" w:line="240" w:lineRule="auto"/>
-            </w:pPr>
-            <w:r>
-              <w:rPr>
-                <w:b w:val="0"/>
-                <w:sz w:val="16"/>
-              </w:rPr>
-              <w:t>Accuracy</w:t>
-            </w:r>
-          </w:p>
-        </w:tc>
-        <w:tc>
-          <w:tcPr>
-            <w:tcW w:type="dxa" w:w="4392"/>
+            <w:tcW w:type="dxa" w:w="2736"/>
+            <w:vAlign w:val="center"/>
+          </w:tcPr>
+          <w:p>
+            <w:pPr>
+              <w:spacing w:before="0" w:after="0" w:line="240" w:lineRule="auto"/>
+            </w:pPr>
+            <w:r>
+              <w:rPr>
+                <w:b w:val="0"/>
+                <w:sz w:val="16"/>
+              </w:rPr>
+              <w:t>Accuracy: Interface will be free from errors</w:t>
+            </w:r>
+          </w:p>
+        </w:tc>
+        <w:tc>
+          <w:tcPr>
+            <w:tcW w:type="dxa" w:w="3528"/>
             <w:vAlign w:val="center"/>
           </w:tcPr>
           <w:p>
@@ -964,7 +959,7 @@
         </w:tc>
         <w:tc>
           <w:tcPr>
-            <w:tcW w:type="dxa" w:w="792"/>
+            <w:tcW w:type="dxa" w:w="1080"/>
             <w:vAlign w:val="center"/>
           </w:tcPr>
           <w:p>
@@ -983,7 +978,7 @@
         </w:tc>
         <w:tc>
           <w:tcPr>
-            <w:tcW w:type="dxa" w:w="3024"/>
+            <w:tcW w:type="dxa" w:w="2405"/>
             <w:vAlign w:val="center"/>
           </w:tcPr>
           <w:p>
@@ -1003,7 +998,7 @@
       <w:tr>
         <w:tc>
           <w:tcPr>
-            <w:tcW w:type="dxa" w:w="461"/>
+            <w:tcW w:type="dxa" w:w="576"/>
             <w:vAlign w:val="center"/>
           </w:tcPr>
           <w:p>
@@ -1022,25 +1017,25 @@
         </w:tc>
         <w:tc>
           <w:tcPr>
-            <w:tcW w:type="dxa" w:w="1656"/>
-            <w:vAlign w:val="center"/>
-          </w:tcPr>
-          <w:p>
-            <w:pPr>
-              <w:spacing w:before="0" w:after="0" w:line="240" w:lineRule="auto"/>
-            </w:pPr>
-            <w:r>
-              <w:rPr>
-                <w:b w:val="0"/>
-                <w:sz w:val="16"/>
-              </w:rPr>
-              <w:t>Technical Clarity</w:t>
-            </w:r>
-          </w:p>
-        </w:tc>
-        <w:tc>
-          <w:tcPr>
-            <w:tcW w:type="dxa" w:w="4392"/>
+            <w:tcW w:type="dxa" w:w="2736"/>
+            <w:vAlign w:val="center"/>
+          </w:tcPr>
+          <w:p>
+            <w:pPr>
+              <w:spacing w:before="0" w:after="0" w:line="240" w:lineRule="auto"/>
+            </w:pPr>
+            <w:r>
+              <w:rPr>
+                <w:b w:val="0"/>
+                <w:sz w:val="16"/>
+              </w:rPr>
+              <w:t>Technical Clarity: Interface will have the highest possible fidelity.</w:t>
+            </w:r>
+          </w:p>
+        </w:tc>
+        <w:tc>
+          <w:tcPr>
+            <w:tcW w:type="dxa" w:w="3528"/>
             <w:vAlign w:val="center"/>
           </w:tcPr>
           <w:p>
@@ -1058,7 +1053,7 @@
         </w:tc>
         <w:tc>
           <w:tcPr>
-            <w:tcW w:type="dxa" w:w="792"/>
+            <w:tcW w:type="dxa" w:w="1080"/>
             <w:vAlign w:val="center"/>
           </w:tcPr>
           <w:p>
@@ -1077,7 +1072,7 @@
         </w:tc>
         <w:tc>
           <w:tcPr>
-            <w:tcW w:type="dxa" w:w="3024"/>
+            <w:tcW w:type="dxa" w:w="2405"/>
             <w:vAlign w:val="center"/>
           </w:tcPr>
           <w:p>
@@ -1097,7 +1092,7 @@
       <w:tr>
         <w:tc>
           <w:tcPr>
-            <w:tcW w:type="dxa" w:w="461"/>
+            <w:tcW w:type="dxa" w:w="576"/>
             <w:vAlign w:val="center"/>
           </w:tcPr>
           <w:p>
@@ -1116,25 +1111,25 @@
         </w:tc>
         <w:tc>
           <w:tcPr>
-            <w:tcW w:type="dxa" w:w="1656"/>
-            <w:vAlign w:val="center"/>
-          </w:tcPr>
-          <w:p>
-            <w:pPr>
-              <w:spacing w:before="0" w:after="0" w:line="240" w:lineRule="auto"/>
-            </w:pPr>
-            <w:r>
-              <w:rPr>
-                <w:b w:val="0"/>
-                <w:sz w:val="16"/>
-              </w:rPr>
-              <w:t>Fulfillment</w:t>
-            </w:r>
-          </w:p>
-        </w:tc>
-        <w:tc>
-          <w:tcPr>
-            <w:tcW w:type="dxa" w:w="4392"/>
+            <w:tcW w:type="dxa" w:w="2736"/>
+            <w:vAlign w:val="center"/>
+          </w:tcPr>
+          <w:p>
+            <w:pPr>
+              <w:spacing w:before="0" w:after="0" w:line="240" w:lineRule="auto"/>
+            </w:pPr>
+            <w:r>
+              <w:rPr>
+                <w:b w:val="0"/>
+                <w:sz w:val="16"/>
+              </w:rPr>
+              <w:t>Fulfillment : The interface will provide a satisfying user experience</w:t>
+            </w:r>
+          </w:p>
+        </w:tc>
+        <w:tc>
+          <w:tcPr>
+            <w:tcW w:type="dxa" w:w="3528"/>
             <w:vAlign w:val="center"/>
           </w:tcPr>
           <w:p>
@@ -1152,7 +1147,7 @@
         </w:tc>
         <w:tc>
           <w:tcPr>
-            <w:tcW w:type="dxa" w:w="792"/>
+            <w:tcW w:type="dxa" w:w="1080"/>
             <w:vAlign w:val="center"/>
           </w:tcPr>
           <w:p>
@@ -1171,7 +1166,7 @@
         </w:tc>
         <w:tc>
           <w:tcPr>
-            <w:tcW w:type="dxa" w:w="3024"/>
+            <w:tcW w:type="dxa" w:w="2405"/>
             <w:vAlign w:val="center"/>
           </w:tcPr>
           <w:p>
@@ -1191,7 +1186,7 @@
       <w:tr>
         <w:tc>
           <w:tcPr>
-            <w:tcW w:type="dxa" w:w="461"/>
+            <w:tcW w:type="dxa" w:w="576"/>
             <w:vAlign w:val="center"/>
           </w:tcPr>
           <w:p>
@@ -1210,25 +1205,25 @@
         </w:tc>
         <w:tc>
           <w:tcPr>
-            <w:tcW w:type="dxa" w:w="1656"/>
-            <w:vAlign w:val="center"/>
-          </w:tcPr>
-          <w:p>
-            <w:pPr>
-              <w:spacing w:before="0" w:after="0" w:line="240" w:lineRule="auto"/>
-            </w:pPr>
-            <w:r>
-              <w:rPr>
-                <w:b w:val="0"/>
-                <w:sz w:val="16"/>
-              </w:rPr>
-              <w:t>Consistency</w:t>
-            </w:r>
-          </w:p>
-        </w:tc>
-        <w:tc>
-          <w:tcPr>
-            <w:tcW w:type="dxa" w:w="4392"/>
+            <w:tcW w:type="dxa" w:w="2736"/>
+            <w:vAlign w:val="center"/>
+          </w:tcPr>
+          <w:p>
+            <w:pPr>
+              <w:spacing w:before="0" w:after="0" w:line="240" w:lineRule="auto"/>
+            </w:pPr>
+            <w:r>
+              <w:rPr>
+                <w:b w:val="0"/>
+                <w:sz w:val="16"/>
+              </w:rPr>
+              <w:t>Consistency: Interface will be consistent</w:t>
+            </w:r>
+          </w:p>
+        </w:tc>
+        <w:tc>
+          <w:tcPr>
+            <w:tcW w:type="dxa" w:w="3528"/>
             <w:vAlign w:val="center"/>
           </w:tcPr>
           <w:p>
@@ -1246,7 +1241,7 @@
         </w:tc>
         <w:tc>
           <w:tcPr>
-            <w:tcW w:type="dxa" w:w="792"/>
+            <w:tcW w:type="dxa" w:w="1080"/>
             <w:vAlign w:val="center"/>
           </w:tcPr>
           <w:p>
@@ -1265,7 +1260,7 @@
         </w:tc>
         <w:tc>
           <w:tcPr>
-            <w:tcW w:type="dxa" w:w="3024"/>
+            <w:tcW w:type="dxa" w:w="2405"/>
             <w:vAlign w:val="center"/>
           </w:tcPr>
           <w:p>
@@ -1285,7 +1280,7 @@
       <w:tr>
         <w:tc>
           <w:tcPr>
-            <w:tcW w:type="dxa" w:w="461"/>
+            <w:tcW w:type="dxa" w:w="576"/>
             <w:vAlign w:val="center"/>
           </w:tcPr>
           <w:p>
@@ -1304,25 +1299,25 @@
         </w:tc>
         <w:tc>
           <w:tcPr>
-            <w:tcW w:type="dxa" w:w="1656"/>
-            <w:vAlign w:val="center"/>
-          </w:tcPr>
-          <w:p>
-            <w:pPr>
-              <w:spacing w:before="0" w:after="0" w:line="240" w:lineRule="auto"/>
-            </w:pPr>
-            <w:r>
-              <w:rPr>
-                <w:b w:val="0"/>
-                <w:sz w:val="16"/>
-              </w:rPr>
-              <w:t>User Support</w:t>
-            </w:r>
-          </w:p>
-        </w:tc>
-        <w:tc>
-          <w:tcPr>
-            <w:tcW w:type="dxa" w:w="4392"/>
+            <w:tcW w:type="dxa" w:w="2736"/>
+            <w:vAlign w:val="center"/>
+          </w:tcPr>
+          <w:p>
+            <w:pPr>
+              <w:spacing w:before="0" w:after="0" w:line="240" w:lineRule="auto"/>
+            </w:pPr>
+            <w:r>
+              <w:rPr>
+                <w:b w:val="0"/>
+                <w:sz w:val="16"/>
+              </w:rPr>
+              <w:t>User Support: Interface will provide additional assistance as needed or requested</w:t>
+            </w:r>
+          </w:p>
+        </w:tc>
+        <w:tc>
+          <w:tcPr>
+            <w:tcW w:type="dxa" w:w="3528"/>
             <w:vAlign w:val="center"/>
           </w:tcPr>
           <w:p>
@@ -1340,7 +1335,7 @@
         </w:tc>
         <w:tc>
           <w:tcPr>
-            <w:tcW w:type="dxa" w:w="792"/>
+            <w:tcW w:type="dxa" w:w="1080"/>
             <w:vAlign w:val="center"/>
           </w:tcPr>
           <w:p>
@@ -1359,7 +1354,7 @@
         </w:tc>
         <w:tc>
           <w:tcPr>
-            <w:tcW w:type="dxa" w:w="3024"/>
+            <w:tcW w:type="dxa" w:w="2405"/>
             <w:vAlign w:val="center"/>
           </w:tcPr>
           <w:p>
@@ -1379,7 +1374,7 @@
       <w:tr>
         <w:tc>
           <w:tcPr>
-            <w:tcW w:type="dxa" w:w="461"/>
+            <w:tcW w:type="dxa" w:w="576"/>
             <w:vAlign w:val="center"/>
           </w:tcPr>
           <w:p>
@@ -1398,25 +1393,25 @@
         </w:tc>
         <w:tc>
           <w:tcPr>
-            <w:tcW w:type="dxa" w:w="1656"/>
-            <w:vAlign w:val="center"/>
-          </w:tcPr>
-          <w:p>
-            <w:pPr>
-              <w:spacing w:before="0" w:after="0" w:line="240" w:lineRule="auto"/>
-            </w:pPr>
-            <w:r>
-              <w:rPr>
-                <w:b w:val="0"/>
-                <w:sz w:val="16"/>
-              </w:rPr>
-              <w:t>Precision</w:t>
-            </w:r>
-          </w:p>
-        </w:tc>
-        <w:tc>
-          <w:tcPr>
-            <w:tcW w:type="dxa" w:w="4392"/>
+            <w:tcW w:type="dxa" w:w="2736"/>
+            <w:vAlign w:val="center"/>
+          </w:tcPr>
+          <w:p>
+            <w:pPr>
+              <w:spacing w:before="0" w:after="0" w:line="240" w:lineRule="auto"/>
+            </w:pPr>
+            <w:r>
+              <w:rPr>
+                <w:b w:val="0"/>
+                <w:sz w:val="16"/>
+              </w:rPr>
+              <w:t>Precision: The interface will allow the users to perform a task exactly</w:t>
+            </w:r>
+          </w:p>
+        </w:tc>
+        <w:tc>
+          <w:tcPr>
+            <w:tcW w:type="dxa" w:w="3528"/>
             <w:vAlign w:val="center"/>
           </w:tcPr>
           <w:p>
@@ -1434,7 +1429,7 @@
         </w:tc>
         <w:tc>
           <w:tcPr>
-            <w:tcW w:type="dxa" w:w="792"/>
+            <w:tcW w:type="dxa" w:w="1080"/>
             <w:vAlign w:val="center"/>
           </w:tcPr>
           <w:p>
@@ -1453,7 +1448,7 @@
         </w:tc>
         <w:tc>
           <w:tcPr>
-            <w:tcW w:type="dxa" w:w="3024"/>
+            <w:tcW w:type="dxa" w:w="2405"/>
             <w:vAlign w:val="center"/>
           </w:tcPr>
           <w:p>
@@ -1473,7 +1468,7 @@
       <w:tr>
         <w:tc>
           <w:tcPr>
-            <w:tcW w:type="dxa" w:w="461"/>
+            <w:tcW w:type="dxa" w:w="576"/>
             <w:vAlign w:val="center"/>
           </w:tcPr>
           <w:p>
@@ -1492,25 +1487,25 @@
         </w:tc>
         <w:tc>
           <w:tcPr>
-            <w:tcW w:type="dxa" w:w="1656"/>
-            <w:vAlign w:val="center"/>
-          </w:tcPr>
-          <w:p>
-            <w:pPr>
-              <w:spacing w:before="0" w:after="0" w:line="240" w:lineRule="auto"/>
-            </w:pPr>
-            <w:r>
-              <w:rPr>
-                <w:b w:val="0"/>
-                <w:sz w:val="16"/>
-              </w:rPr>
-              <w:t>Forgiveness</w:t>
-            </w:r>
-          </w:p>
-        </w:tc>
-        <w:tc>
-          <w:tcPr>
-            <w:tcW w:type="dxa" w:w="4392"/>
+            <w:tcW w:type="dxa" w:w="2736"/>
+            <w:vAlign w:val="center"/>
+          </w:tcPr>
+          <w:p>
+            <w:pPr>
+              <w:spacing w:before="0" w:after="0" w:line="240" w:lineRule="auto"/>
+            </w:pPr>
+            <w:r>
+              <w:rPr>
+                <w:b w:val="0"/>
+                <w:sz w:val="16"/>
+              </w:rPr>
+              <w:t>Forgiveness: Interface will make action recoverable</w:t>
+            </w:r>
+          </w:p>
+        </w:tc>
+        <w:tc>
+          <w:tcPr>
+            <w:tcW w:type="dxa" w:w="3528"/>
             <w:vAlign w:val="center"/>
           </w:tcPr>
           <w:p>
@@ -1528,7 +1523,7 @@
         </w:tc>
         <w:tc>
           <w:tcPr>
-            <w:tcW w:type="dxa" w:w="792"/>
+            <w:tcW w:type="dxa" w:w="1080"/>
             <w:vAlign w:val="center"/>
           </w:tcPr>
           <w:p>
@@ -1547,7 +1542,7 @@
         </w:tc>
         <w:tc>
           <w:tcPr>
-            <w:tcW w:type="dxa" w:w="3024"/>
+            <w:tcW w:type="dxa" w:w="2405"/>
             <w:vAlign w:val="center"/>
           </w:tcPr>
           <w:p>
@@ -1567,7 +1562,7 @@
       <w:tr>
         <w:tc>
           <w:tcPr>
-            <w:tcW w:type="dxa" w:w="461"/>
+            <w:tcW w:type="dxa" w:w="576"/>
             <w:vAlign w:val="center"/>
           </w:tcPr>
           <w:p>
@@ -1586,25 +1581,25 @@
         </w:tc>
         <w:tc>
           <w:tcPr>
-            <w:tcW w:type="dxa" w:w="1656"/>
-            <w:vAlign w:val="center"/>
-          </w:tcPr>
-          <w:p>
-            <w:pPr>
-              <w:spacing w:before="0" w:after="0" w:line="240" w:lineRule="auto"/>
-            </w:pPr>
-            <w:r>
-              <w:rPr>
-                <w:b w:val="0"/>
-                <w:sz w:val="16"/>
-              </w:rPr>
-              <w:t>Responsiveness</w:t>
-            </w:r>
-          </w:p>
-        </w:tc>
-        <w:tc>
-          <w:tcPr>
-            <w:tcW w:type="dxa" w:w="4392"/>
+            <w:tcW w:type="dxa" w:w="2736"/>
+            <w:vAlign w:val="center"/>
+          </w:tcPr>
+          <w:p>
+            <w:pPr>
+              <w:spacing w:before="0" w:after="0" w:line="240" w:lineRule="auto"/>
+            </w:pPr>
+            <w:r>
+              <w:rPr>
+                <w:b w:val="0"/>
+                <w:sz w:val="16"/>
+              </w:rPr>
+              <w:t>Responsiveness: The interface will inform users about the results of their actions and their interface status</w:t>
+            </w:r>
+          </w:p>
+        </w:tc>
+        <w:tc>
+          <w:tcPr>
+            <w:tcW w:type="dxa" w:w="3528"/>
             <w:vAlign w:val="center"/>
           </w:tcPr>
           <w:p>
@@ -1622,7 +1617,7 @@
         </w:tc>
         <w:tc>
           <w:tcPr>
-            <w:tcW w:type="dxa" w:w="792"/>
+            <w:tcW w:type="dxa" w:w="1080"/>
             <w:vAlign w:val="center"/>
           </w:tcPr>
           <w:p>
@@ -1641,7 +1636,7 @@
         </w:tc>
         <w:tc>
           <w:tcPr>
-            <w:tcW w:type="dxa" w:w="3024"/>
+            <w:tcW w:type="dxa" w:w="2405"/>
             <w:vAlign w:val="center"/>
           </w:tcPr>
           <w:p>
@@ -1661,25 +1656,25 @@
       <w:tr>
         <w:tc>
           <w:tcPr>
-            <w:tcW w:type="dxa" w:w="461"/>
-            <w:vAlign w:val="center"/>
-          </w:tcPr>
-          <w:p>
-            <w:pPr>
-              <w:spacing w:before="0" w:after="0" w:line="240" w:lineRule="auto"/>
-              <w:jc w:val="center"/>
-            </w:pPr>
-            <w:r>
-              <w:rPr>
-                <w:b/>
-                <w:sz w:val="16"/>
-              </w:rPr>
-            </w:r>
-          </w:p>
-        </w:tc>
-        <w:tc>
-          <w:tcPr>
-            <w:tcW w:type="dxa" w:w="1656"/>
+            <w:tcW w:type="dxa" w:w="576"/>
+            <w:vAlign w:val="center"/>
+          </w:tcPr>
+          <w:p>
+            <w:pPr>
+              <w:spacing w:before="0" w:after="0" w:line="240" w:lineRule="auto"/>
+              <w:jc w:val="center"/>
+            </w:pPr>
+            <w:r>
+              <w:rPr>
+                <w:b/>
+                <w:sz w:val="16"/>
+              </w:rPr>
+            </w:r>
+          </w:p>
+        </w:tc>
+        <w:tc>
+          <w:tcPr>
+            <w:tcW w:type="dxa" w:w="2736"/>
             <w:vAlign w:val="center"/>
           </w:tcPr>
           <w:p>
@@ -1697,24 +1692,24 @@
         </w:tc>
         <w:tc>
           <w:tcPr>
-            <w:tcW w:type="dxa" w:w="4392"/>
-            <w:vAlign w:val="center"/>
-          </w:tcPr>
-          <w:p>
-            <w:pPr>
-              <w:spacing w:before="0" w:after="0" w:line="240" w:lineRule="auto"/>
-            </w:pPr>
-            <w:r>
-              <w:rPr>
-                <w:b/>
-                <w:sz w:val="16"/>
-              </w:rPr>
-            </w:r>
-          </w:p>
-        </w:tc>
-        <w:tc>
-          <w:tcPr>
-            <w:tcW w:type="dxa" w:w="792"/>
+            <w:tcW w:type="dxa" w:w="3528"/>
+            <w:vAlign w:val="center"/>
+          </w:tcPr>
+          <w:p>
+            <w:pPr>
+              <w:spacing w:before="0" w:after="0" w:line="240" w:lineRule="auto"/>
+            </w:pPr>
+            <w:r>
+              <w:rPr>
+                <w:b/>
+                <w:sz w:val="16"/>
+              </w:rPr>
+            </w:r>
+          </w:p>
+        </w:tc>
+        <w:tc>
+          <w:tcPr>
+            <w:tcW w:type="dxa" w:w="1080"/>
             <w:vAlign w:val="center"/>
           </w:tcPr>
           <w:p>
@@ -1733,7 +1728,7 @@
         </w:tc>
         <w:tc>
           <w:tcPr>
-            <w:tcW w:type="dxa" w:w="3024"/>
+            <w:tcW w:type="dxa" w:w="2405"/>
             <w:vAlign w:val="center"/>
           </w:tcPr>
           <w:p>
@@ -1787,19 +1782,18 @@
           <w:tcPr>
             <w:tcW w:type="dxa" w:w="576"/>
             <w:vAlign w:val="center"/>
-            <w:shd w:val="clear" w:color="auto" w:fill="D9E2DC"/>
-          </w:tcPr>
-          <w:p>
-            <w:pPr>
-              <w:spacing w:before="0" w:after="0" w:line="240" w:lineRule="auto"/>
-              <w:jc w:val="center"/>
-            </w:pPr>
-            <w:r>
-              <w:rPr>
-                <w:b/>
-                <w:sz w:val="16"/>
-              </w:rPr>
-              <w:t>No.</w:t>
+          </w:tcPr>
+          <w:p>
+            <w:pPr>
+              <w:spacing w:before="0" w:after="0" w:line="240" w:lineRule="auto"/>
+              <w:jc w:val="center"/>
+            </w:pPr>
+            <w:r>
+              <w:rPr>
+                <w:b/>
+                <w:sz w:val="16"/>
+              </w:rPr>
+              <w:t>S.NO</w:t>
             </w:r>
           </w:p>
         </w:tc>
@@ -1807,18 +1801,17 @@
           <w:tcPr>
             <w:tcW w:type="dxa" w:w="5112"/>
             <w:vAlign w:val="center"/>
-            <w:shd w:val="clear" w:color="auto" w:fill="D9E2DC"/>
-          </w:tcPr>
-          <w:p>
-            <w:pPr>
-              <w:spacing w:before="0" w:after="0" w:line="240" w:lineRule="auto"/>
-            </w:pPr>
-            <w:r>
-              <w:rPr>
-                <w:b/>
-                <w:sz w:val="16"/>
-              </w:rPr>
-              <w:t>Observations</w:t>
+          </w:tcPr>
+          <w:p>
+            <w:pPr>
+              <w:spacing w:before="0" w:after="0" w:line="240" w:lineRule="auto"/>
+            </w:pPr>
+            <w:r>
+              <w:rPr>
+                <w:b/>
+                <w:sz w:val="16"/>
+              </w:rPr>
+              <w:t>OBSERVATIONS</w:t>
             </w:r>
           </w:p>
         </w:tc>
@@ -1826,18 +1819,17 @@
           <w:tcPr>
             <w:tcW w:type="dxa" w:w="4637"/>
             <w:vAlign w:val="center"/>
-            <w:shd w:val="clear" w:color="auto" w:fill="D9E2DC"/>
-          </w:tcPr>
-          <w:p>
-            <w:pPr>
-              <w:spacing w:before="0" w:after="0" w:line="240" w:lineRule="auto"/>
-            </w:pPr>
-            <w:r>
-              <w:rPr>
-                <w:b/>
-                <w:sz w:val="16"/>
-              </w:rPr>
-              <w:t>Comments</w:t>
+          </w:tcPr>
+          <w:p>
+            <w:pPr>
+              <w:spacing w:before="0" w:after="0" w:line="240" w:lineRule="auto"/>
+            </w:pPr>
+            <w:r>
+              <w:rPr>
+                <w:b/>
+                <w:sz w:val="16"/>
+              </w:rPr>
+              <w:t>COMMENTS</w:t>
             </w:r>
           </w:p>
         </w:tc>
@@ -2116,96 +2108,91 @@
         <w:tblLayout w:type="fixed"/>
       </w:tblPr>
       <w:tblGrid>
-        <w:gridCol w:w="460"/>
-        <w:gridCol w:w="1655"/>
-        <w:gridCol w:w="4392"/>
-        <w:gridCol w:w="792"/>
-        <w:gridCol w:w="3024"/>
+        <w:gridCol w:w="576"/>
+        <w:gridCol w:w="2736"/>
+        <w:gridCol w:w="3528"/>
+        <w:gridCol w:w="1080"/>
+        <w:gridCol w:w="2404"/>
       </w:tblGrid>
       <w:tr>
         <w:tc>
           <w:tcPr>
-            <w:tcW w:type="dxa" w:w="461"/>
-            <w:vAlign w:val="center"/>
-            <w:shd w:val="clear" w:color="auto" w:fill="D9E2DC"/>
-          </w:tcPr>
-          <w:p>
-            <w:pPr>
-              <w:spacing w:before="0" w:after="0" w:line="240" w:lineRule="auto"/>
-              <w:jc w:val="center"/>
-            </w:pPr>
-            <w:r>
-              <w:rPr>
-                <w:b/>
-                <w:sz w:val="16"/>
-              </w:rPr>
-              <w:t>No.</w:t>
-            </w:r>
-          </w:p>
-        </w:tc>
-        <w:tc>
-          <w:tcPr>
-            <w:tcW w:type="dxa" w:w="1656"/>
-            <w:vAlign w:val="center"/>
-            <w:shd w:val="clear" w:color="auto" w:fill="D9E2DC"/>
-          </w:tcPr>
-          <w:p>
-            <w:pPr>
-              <w:spacing w:before="0" w:after="0" w:line="240" w:lineRule="auto"/>
-            </w:pPr>
-            <w:r>
-              <w:rPr>
-                <w:b/>
-                <w:sz w:val="16"/>
-              </w:rPr>
-              <w:t>Heuristic</w:t>
-            </w:r>
-          </w:p>
-        </w:tc>
-        <w:tc>
-          <w:tcPr>
-            <w:tcW w:type="dxa" w:w="4392"/>
-            <w:vAlign w:val="center"/>
-            <w:shd w:val="clear" w:color="auto" w:fill="D9E2DC"/>
-          </w:tcPr>
-          <w:p>
-            <w:pPr>
-              <w:spacing w:before="0" w:after="0" w:line="240" w:lineRule="auto"/>
-            </w:pPr>
-            <w:r>
-              <w:rPr>
-                <w:b/>
-                <w:sz w:val="16"/>
-              </w:rPr>
-              <w:t>Violation (if any)</w:t>
-            </w:r>
-          </w:p>
-        </w:tc>
-        <w:tc>
-          <w:tcPr>
-            <w:tcW w:type="dxa" w:w="792"/>
-            <w:vAlign w:val="center"/>
-            <w:shd w:val="clear" w:color="auto" w:fill="D9E2DC"/>
-          </w:tcPr>
-          <w:p>
-            <w:pPr>
-              <w:spacing w:before="0" w:after="0" w:line="240" w:lineRule="auto"/>
-              <w:jc w:val="center"/>
-            </w:pPr>
-            <w:r>
-              <w:rPr>
-                <w:b/>
-                <w:sz w:val="16"/>
-              </w:rPr>
-              <w:t>Severity (0-5)</w:t>
-            </w:r>
-          </w:p>
-        </w:tc>
-        <w:tc>
-          <w:tcPr>
-            <w:tcW w:type="dxa" w:w="3024"/>
-            <w:vAlign w:val="center"/>
-            <w:shd w:val="clear" w:color="auto" w:fill="D9E2DC"/>
+            <w:tcW w:type="dxa" w:w="576"/>
+            <w:vAlign w:val="center"/>
+          </w:tcPr>
+          <w:p>
+            <w:pPr>
+              <w:spacing w:before="0" w:after="0" w:line="240" w:lineRule="auto"/>
+              <w:jc w:val="center"/>
+            </w:pPr>
+            <w:r>
+              <w:rPr>
+                <w:b/>
+                <w:sz w:val="16"/>
+              </w:rPr>
+              <w:t>S.No.</w:t>
+            </w:r>
+          </w:p>
+        </w:tc>
+        <w:tc>
+          <w:tcPr>
+            <w:tcW w:type="dxa" w:w="2736"/>
+            <w:vAlign w:val="center"/>
+          </w:tcPr>
+          <w:p>
+            <w:pPr>
+              <w:spacing w:before="0" w:after="0" w:line="240" w:lineRule="auto"/>
+            </w:pPr>
+            <w:r>
+              <w:rPr>
+                <w:b/>
+                <w:sz w:val="16"/>
+              </w:rPr>
+              <w:t>Heuristic Evaluation Parameter</w:t>
+            </w:r>
+          </w:p>
+        </w:tc>
+        <w:tc>
+          <w:tcPr>
+            <w:tcW w:type="dxa" w:w="3528"/>
+            <w:vAlign w:val="center"/>
+          </w:tcPr>
+          <w:p>
+            <w:pPr>
+              <w:spacing w:before="0" w:after="0" w:line="240" w:lineRule="auto"/>
+            </w:pPr>
+            <w:r>
+              <w:rPr>
+                <w:b/>
+                <w:sz w:val="16"/>
+              </w:rPr>
+              <w:t>Mention Violation if any</w:t>
+            </w:r>
+          </w:p>
+        </w:tc>
+        <w:tc>
+          <w:tcPr>
+            <w:tcW w:type="dxa" w:w="1080"/>
+            <w:vAlign w:val="center"/>
+          </w:tcPr>
+          <w:p>
+            <w:pPr>
+              <w:spacing w:before="0" w:after="0" w:line="240" w:lineRule="auto"/>
+              <w:jc w:val="center"/>
+            </w:pPr>
+            <w:r>
+              <w:rPr>
+                <w:b/>
+                <w:sz w:val="16"/>
+              </w:rPr>
+              <w:t>Severity  0-5 (0- minimum and 5 is maximium)</w:t>
+            </w:r>
+          </w:p>
+        </w:tc>
+        <w:tc>
+          <w:tcPr>
+            <w:tcW w:type="dxa" w:w="2405"/>
+            <w:vAlign w:val="center"/>
           </w:tcPr>
           <w:p>
             <w:pPr>
@@ -2224,7 +2211,7 @@
       <w:tr>
         <w:tc>
           <w:tcPr>
-            <w:tcW w:type="dxa" w:w="461"/>
+            <w:tcW w:type="dxa" w:w="576"/>
             <w:vAlign w:val="center"/>
           </w:tcPr>
           <w:p>
@@ -2243,25 +2230,25 @@
         </w:tc>
         <w:tc>
           <w:tcPr>
-            <w:tcW w:type="dxa" w:w="1656"/>
-            <w:vAlign w:val="center"/>
-          </w:tcPr>
-          <w:p>
-            <w:pPr>
-              <w:spacing w:before="0" w:after="0" w:line="240" w:lineRule="auto"/>
-            </w:pPr>
-            <w:r>
-              <w:rPr>
-                <w:b w:val="0"/>
-                <w:sz w:val="16"/>
-              </w:rPr>
-              <w:t>User Control</w:t>
-            </w:r>
-          </w:p>
-        </w:tc>
-        <w:tc>
-          <w:tcPr>
-            <w:tcW w:type="dxa" w:w="4392"/>
+            <w:tcW w:type="dxa" w:w="2736"/>
+            <w:vAlign w:val="center"/>
+          </w:tcPr>
+          <w:p>
+            <w:pPr>
+              <w:spacing w:before="0" w:after="0" w:line="240" w:lineRule="auto"/>
+            </w:pPr>
+            <w:r>
+              <w:rPr>
+                <w:b w:val="0"/>
+                <w:sz w:val="16"/>
+              </w:rPr>
+              <w:t>User Control: Interface will allow the user to perceive that they are in control</w:t>
+            </w:r>
+          </w:p>
+        </w:tc>
+        <w:tc>
+          <w:tcPr>
+            <w:tcW w:type="dxa" w:w="3528"/>
             <w:vAlign w:val="center"/>
           </w:tcPr>
           <w:p>
@@ -2279,7 +2266,7 @@
         </w:tc>
         <w:tc>
           <w:tcPr>
-            <w:tcW w:type="dxa" w:w="792"/>
+            <w:tcW w:type="dxa" w:w="1080"/>
             <w:vAlign w:val="center"/>
           </w:tcPr>
           <w:p>
@@ -2298,7 +2285,7 @@
         </w:tc>
         <w:tc>
           <w:tcPr>
-            <w:tcW w:type="dxa" w:w="3024"/>
+            <w:tcW w:type="dxa" w:w="2405"/>
             <w:vAlign w:val="center"/>
           </w:tcPr>
           <w:p>
@@ -2318,7 +2305,7 @@
       <w:tr>
         <w:tc>
           <w:tcPr>
-            <w:tcW w:type="dxa" w:w="461"/>
+            <w:tcW w:type="dxa" w:w="576"/>
             <w:vAlign w:val="center"/>
           </w:tcPr>
           <w:p>
@@ -2337,25 +2324,25 @@
         </w:tc>
         <w:tc>
           <w:tcPr>
-            <w:tcW w:type="dxa" w:w="1656"/>
-            <w:vAlign w:val="center"/>
-          </w:tcPr>
-          <w:p>
-            <w:pPr>
-              <w:spacing w:before="0" w:after="0" w:line="240" w:lineRule="auto"/>
-            </w:pPr>
-            <w:r>
-              <w:rPr>
-                <w:b w:val="0"/>
-                <w:sz w:val="16"/>
-              </w:rPr>
-              <w:t>Human Limitations</w:t>
-            </w:r>
-          </w:p>
-        </w:tc>
-        <w:tc>
-          <w:tcPr>
-            <w:tcW w:type="dxa" w:w="4392"/>
+            <w:tcW w:type="dxa" w:w="2736"/>
+            <w:vAlign w:val="center"/>
+          </w:tcPr>
+          <w:p>
+            <w:pPr>
+              <w:spacing w:before="0" w:after="0" w:line="240" w:lineRule="auto"/>
+            </w:pPr>
+            <w:r>
+              <w:rPr>
+                <w:b w:val="0"/>
+                <w:sz w:val="16"/>
+              </w:rPr>
+              <w:t>Human Limitations: Interface will not overload the users cognitive, auditory and motor skills</w:t>
+            </w:r>
+          </w:p>
+        </w:tc>
+        <w:tc>
+          <w:tcPr>
+            <w:tcW w:type="dxa" w:w="3528"/>
             <w:vAlign w:val="center"/>
           </w:tcPr>
           <w:p>
@@ -2373,7 +2360,7 @@
         </w:tc>
         <w:tc>
           <w:tcPr>
-            <w:tcW w:type="dxa" w:w="792"/>
+            <w:tcW w:type="dxa" w:w="1080"/>
             <w:vAlign w:val="center"/>
           </w:tcPr>
           <w:p>
@@ -2392,7 +2379,7 @@
         </w:tc>
         <w:tc>
           <w:tcPr>
-            <w:tcW w:type="dxa" w:w="3024"/>
+            <w:tcW w:type="dxa" w:w="2405"/>
             <w:vAlign w:val="center"/>
           </w:tcPr>
           <w:p>
@@ -2412,7 +2399,7 @@
       <w:tr>
         <w:tc>
           <w:tcPr>
-            <w:tcW w:type="dxa" w:w="461"/>
+            <w:tcW w:type="dxa" w:w="576"/>
             <w:vAlign w:val="center"/>
           </w:tcPr>
           <w:p>
@@ -2431,25 +2418,25 @@
         </w:tc>
         <w:tc>
           <w:tcPr>
-            <w:tcW w:type="dxa" w:w="1656"/>
-            <w:vAlign w:val="center"/>
-          </w:tcPr>
-          <w:p>
-            <w:pPr>
-              <w:spacing w:before="0" w:after="0" w:line="240" w:lineRule="auto"/>
-            </w:pPr>
-            <w:r>
-              <w:rPr>
-                <w:b w:val="0"/>
-                <w:sz w:val="16"/>
-              </w:rPr>
-              <w:t>Accommodation</w:t>
-            </w:r>
-          </w:p>
-        </w:tc>
-        <w:tc>
-          <w:tcPr>
-            <w:tcW w:type="dxa" w:w="4392"/>
+            <w:tcW w:type="dxa" w:w="2736"/>
+            <w:vAlign w:val="center"/>
+          </w:tcPr>
+          <w:p>
+            <w:pPr>
+              <w:spacing w:before="0" w:after="0" w:line="240" w:lineRule="auto"/>
+            </w:pPr>
+            <w:r>
+              <w:rPr>
+                <w:b w:val="0"/>
+                <w:sz w:val="16"/>
+              </w:rPr>
+              <w:t>Accommodation: The interface will fit the way each user group works and thinks (personas)</w:t>
+            </w:r>
+          </w:p>
+        </w:tc>
+        <w:tc>
+          <w:tcPr>
+            <w:tcW w:type="dxa" w:w="3528"/>
             <w:vAlign w:val="center"/>
           </w:tcPr>
           <w:p>
@@ -2467,7 +2454,7 @@
         </w:tc>
         <w:tc>
           <w:tcPr>
-            <w:tcW w:type="dxa" w:w="792"/>
+            <w:tcW w:type="dxa" w:w="1080"/>
             <w:vAlign w:val="center"/>
           </w:tcPr>
           <w:p>
@@ -2486,7 +2473,7 @@
         </w:tc>
         <w:tc>
           <w:tcPr>
-            <w:tcW w:type="dxa" w:w="3024"/>
+            <w:tcW w:type="dxa" w:w="2405"/>
             <w:vAlign w:val="center"/>
           </w:tcPr>
           <w:p>
@@ -2506,7 +2493,7 @@
       <w:tr>
         <w:tc>
           <w:tcPr>
-            <w:tcW w:type="dxa" w:w="461"/>
+            <w:tcW w:type="dxa" w:w="576"/>
             <w:vAlign w:val="center"/>
           </w:tcPr>
           <w:p>
@@ -2525,25 +2512,25 @@
         </w:tc>
         <w:tc>
           <w:tcPr>
-            <w:tcW w:type="dxa" w:w="1656"/>
-            <w:vAlign w:val="center"/>
-          </w:tcPr>
-          <w:p>
-            <w:pPr>
-              <w:spacing w:before="0" w:after="0" w:line="240" w:lineRule="auto"/>
-            </w:pPr>
-            <w:r>
-              <w:rPr>
-                <w:b w:val="0"/>
-                <w:sz w:val="16"/>
-              </w:rPr>
-              <w:t>Linguistic Clarity</w:t>
-            </w:r>
-          </w:p>
-        </w:tc>
-        <w:tc>
-          <w:tcPr>
-            <w:tcW w:type="dxa" w:w="4392"/>
+            <w:tcW w:type="dxa" w:w="2736"/>
+            <w:vAlign w:val="center"/>
+          </w:tcPr>
+          <w:p>
+            <w:pPr>
+              <w:spacing w:before="0" w:after="0" w:line="240" w:lineRule="auto"/>
+            </w:pPr>
+            <w:r>
+              <w:rPr>
+                <w:b w:val="0"/>
+                <w:sz w:val="16"/>
+              </w:rPr>
+              <w:t>Linguistic Clarity: Interface will communicate as efficiently as possible</w:t>
+            </w:r>
+          </w:p>
+        </w:tc>
+        <w:tc>
+          <w:tcPr>
+            <w:tcW w:type="dxa" w:w="3528"/>
             <w:vAlign w:val="center"/>
           </w:tcPr>
           <w:p>
@@ -2561,7 +2548,7 @@
         </w:tc>
         <w:tc>
           <w:tcPr>
-            <w:tcW w:type="dxa" w:w="792"/>
+            <w:tcW w:type="dxa" w:w="1080"/>
             <w:vAlign w:val="center"/>
           </w:tcPr>
           <w:p>
@@ -2580,7 +2567,7 @@
         </w:tc>
         <w:tc>
           <w:tcPr>
-            <w:tcW w:type="dxa" w:w="3024"/>
+            <w:tcW w:type="dxa" w:w="2405"/>
             <w:vAlign w:val="center"/>
           </w:tcPr>
           <w:p>
@@ -2600,7 +2587,7 @@
       <w:tr>
         <w:tc>
           <w:tcPr>
-            <w:tcW w:type="dxa" w:w="461"/>
+            <w:tcW w:type="dxa" w:w="576"/>
             <w:vAlign w:val="center"/>
           </w:tcPr>
           <w:p>
@@ -2619,25 +2606,25 @@
         </w:tc>
         <w:tc>
           <w:tcPr>
-            <w:tcW w:type="dxa" w:w="1656"/>
-            <w:vAlign w:val="center"/>
-          </w:tcPr>
-          <w:p>
-            <w:pPr>
-              <w:spacing w:before="0" w:after="0" w:line="240" w:lineRule="auto"/>
-            </w:pPr>
-            <w:r>
-              <w:rPr>
-                <w:b w:val="0"/>
-                <w:sz w:val="16"/>
-              </w:rPr>
-              <w:t>Aesthetic Integrity</w:t>
-            </w:r>
-          </w:p>
-        </w:tc>
-        <w:tc>
-          <w:tcPr>
-            <w:tcW w:type="dxa" w:w="4392"/>
+            <w:tcW w:type="dxa" w:w="2736"/>
+            <w:vAlign w:val="center"/>
+          </w:tcPr>
+          <w:p>
+            <w:pPr>
+              <w:spacing w:before="0" w:after="0" w:line="240" w:lineRule="auto"/>
+            </w:pPr>
+            <w:r>
+              <w:rPr>
+                <w:b w:val="0"/>
+                <w:sz w:val="16"/>
+              </w:rPr>
+              <w:t>Aesthetic Integrity :The interface will have an attractive and appropriate design</w:t>
+            </w:r>
+          </w:p>
+        </w:tc>
+        <w:tc>
+          <w:tcPr>
+            <w:tcW w:type="dxa" w:w="3528"/>
             <w:vAlign w:val="center"/>
           </w:tcPr>
           <w:p>
@@ -2655,7 +2642,7 @@
         </w:tc>
         <w:tc>
           <w:tcPr>
-            <w:tcW w:type="dxa" w:w="792"/>
+            <w:tcW w:type="dxa" w:w="1080"/>
             <w:vAlign w:val="center"/>
           </w:tcPr>
           <w:p>
@@ -2674,7 +2661,7 @@
         </w:tc>
         <w:tc>
           <w:tcPr>
-            <w:tcW w:type="dxa" w:w="3024"/>
+            <w:tcW w:type="dxa" w:w="2405"/>
             <w:vAlign w:val="center"/>
           </w:tcPr>
           <w:p>
@@ -2694,7 +2681,7 @@
       <w:tr>
         <w:tc>
           <w:tcPr>
-            <w:tcW w:type="dxa" w:w="461"/>
+            <w:tcW w:type="dxa" w:w="576"/>
             <w:vAlign w:val="center"/>
           </w:tcPr>
           <w:p>
@@ -2713,25 +2700,25 @@
         </w:tc>
         <w:tc>
           <w:tcPr>
-            <w:tcW w:type="dxa" w:w="1656"/>
-            <w:vAlign w:val="center"/>
-          </w:tcPr>
-          <w:p>
-            <w:pPr>
-              <w:spacing w:before="0" w:after="0" w:line="240" w:lineRule="auto"/>
-            </w:pPr>
-            <w:r>
-              <w:rPr>
-                <w:b w:val="0"/>
-                <w:sz w:val="16"/>
-              </w:rPr>
-              <w:t>Simplicity</w:t>
-            </w:r>
-          </w:p>
-        </w:tc>
-        <w:tc>
-          <w:tcPr>
-            <w:tcW w:type="dxa" w:w="4392"/>
+            <w:tcW w:type="dxa" w:w="2736"/>
+            <w:vAlign w:val="center"/>
+          </w:tcPr>
+          <w:p>
+            <w:pPr>
+              <w:spacing w:before="0" w:after="0" w:line="240" w:lineRule="auto"/>
+            </w:pPr>
+            <w:r>
+              <w:rPr>
+                <w:b w:val="0"/>
+                <w:sz w:val="16"/>
+              </w:rPr>
+              <w:t>Simplicity: The interface will have a simple design</w:t>
+            </w:r>
+          </w:p>
+        </w:tc>
+        <w:tc>
+          <w:tcPr>
+            <w:tcW w:type="dxa" w:w="3528"/>
             <w:vAlign w:val="center"/>
           </w:tcPr>
           <w:p>
@@ -2749,7 +2736,7 @@
         </w:tc>
         <w:tc>
           <w:tcPr>
-            <w:tcW w:type="dxa" w:w="792"/>
+            <w:tcW w:type="dxa" w:w="1080"/>
             <w:vAlign w:val="center"/>
           </w:tcPr>
           <w:p>
@@ -2768,7 +2755,7 @@
         </w:tc>
         <w:tc>
           <w:tcPr>
-            <w:tcW w:type="dxa" w:w="3024"/>
+            <w:tcW w:type="dxa" w:w="2405"/>
             <w:vAlign w:val="center"/>
           </w:tcPr>
           <w:p>
@@ -2788,7 +2775,7 @@
       <w:tr>
         <w:tc>
           <w:tcPr>
-            <w:tcW w:type="dxa" w:w="461"/>
+            <w:tcW w:type="dxa" w:w="576"/>
             <w:vAlign w:val="center"/>
           </w:tcPr>
           <w:p>
@@ -2807,25 +2794,25 @@
         </w:tc>
         <w:tc>
           <w:tcPr>
-            <w:tcW w:type="dxa" w:w="1656"/>
-            <w:vAlign w:val="center"/>
-          </w:tcPr>
-          <w:p>
-            <w:pPr>
-              <w:spacing w:before="0" w:after="0" w:line="240" w:lineRule="auto"/>
-            </w:pPr>
-            <w:r>
-              <w:rPr>
-                <w:b w:val="0"/>
-                <w:sz w:val="16"/>
-              </w:rPr>
-              <w:t>Predictability</w:t>
-            </w:r>
-          </w:p>
-        </w:tc>
-        <w:tc>
-          <w:tcPr>
-            <w:tcW w:type="dxa" w:w="4392"/>
+            <w:tcW w:type="dxa" w:w="2736"/>
+            <w:vAlign w:val="center"/>
+          </w:tcPr>
+          <w:p>
+            <w:pPr>
+              <w:spacing w:before="0" w:after="0" w:line="240" w:lineRule="auto"/>
+            </w:pPr>
+            <w:r>
+              <w:rPr>
+                <w:b w:val="0"/>
+                <w:sz w:val="16"/>
+              </w:rPr>
+              <w:t>Predictability :The interface will behave in such a manner that the user can accurately predict what will happen next</w:t>
+            </w:r>
+          </w:p>
+        </w:tc>
+        <w:tc>
+          <w:tcPr>
+            <w:tcW w:type="dxa" w:w="3528"/>
             <w:vAlign w:val="center"/>
           </w:tcPr>
           <w:p>
@@ -2843,7 +2830,7 @@
         </w:tc>
         <w:tc>
           <w:tcPr>
-            <w:tcW w:type="dxa" w:w="792"/>
+            <w:tcW w:type="dxa" w:w="1080"/>
             <w:vAlign w:val="center"/>
           </w:tcPr>
           <w:p>
@@ -2862,7 +2849,7 @@
         </w:tc>
         <w:tc>
           <w:tcPr>
-            <w:tcW w:type="dxa" w:w="3024"/>
+            <w:tcW w:type="dxa" w:w="2405"/>
             <w:vAlign w:val="center"/>
           </w:tcPr>
           <w:p>
@@ -2882,7 +2869,7 @@
       <w:tr>
         <w:tc>
           <w:tcPr>
-            <w:tcW w:type="dxa" w:w="461"/>
+            <w:tcW w:type="dxa" w:w="576"/>
             <w:vAlign w:val="center"/>
           </w:tcPr>
           <w:p>
@@ -2901,25 +2888,25 @@
         </w:tc>
         <w:tc>
           <w:tcPr>
-            <w:tcW w:type="dxa" w:w="1656"/>
-            <w:vAlign w:val="center"/>
-          </w:tcPr>
-          <w:p>
-            <w:pPr>
-              <w:spacing w:before="0" w:after="0" w:line="240" w:lineRule="auto"/>
-            </w:pPr>
-            <w:r>
-              <w:rPr>
-                <w:b w:val="0"/>
-                <w:sz w:val="16"/>
-              </w:rPr>
-              <w:t>Accuracy</w:t>
-            </w:r>
-          </w:p>
-        </w:tc>
-        <w:tc>
-          <w:tcPr>
-            <w:tcW w:type="dxa" w:w="4392"/>
+            <w:tcW w:type="dxa" w:w="2736"/>
+            <w:vAlign w:val="center"/>
+          </w:tcPr>
+          <w:p>
+            <w:pPr>
+              <w:spacing w:before="0" w:after="0" w:line="240" w:lineRule="auto"/>
+            </w:pPr>
+            <w:r>
+              <w:rPr>
+                <w:b w:val="0"/>
+                <w:sz w:val="16"/>
+              </w:rPr>
+              <w:t>Accuracy: Interface will be free from errors</w:t>
+            </w:r>
+          </w:p>
+        </w:tc>
+        <w:tc>
+          <w:tcPr>
+            <w:tcW w:type="dxa" w:w="3528"/>
             <w:vAlign w:val="center"/>
           </w:tcPr>
           <w:p>
@@ -2937,7 +2924,7 @@
         </w:tc>
         <w:tc>
           <w:tcPr>
-            <w:tcW w:type="dxa" w:w="792"/>
+            <w:tcW w:type="dxa" w:w="1080"/>
             <w:vAlign w:val="center"/>
           </w:tcPr>
           <w:p>
@@ -2956,7 +2943,7 @@
         </w:tc>
         <w:tc>
           <w:tcPr>
-            <w:tcW w:type="dxa" w:w="3024"/>
+            <w:tcW w:type="dxa" w:w="2405"/>
             <w:vAlign w:val="center"/>
           </w:tcPr>
           <w:p>
@@ -2976,7 +2963,7 @@
       <w:tr>
         <w:tc>
           <w:tcPr>
-            <w:tcW w:type="dxa" w:w="461"/>
+            <w:tcW w:type="dxa" w:w="576"/>
             <w:vAlign w:val="center"/>
           </w:tcPr>
           <w:p>
@@ -2995,25 +2982,25 @@
         </w:tc>
         <w:tc>
           <w:tcPr>
-            <w:tcW w:type="dxa" w:w="1656"/>
-            <w:vAlign w:val="center"/>
-          </w:tcPr>
-          <w:p>
-            <w:pPr>
-              <w:spacing w:before="0" w:after="0" w:line="240" w:lineRule="auto"/>
-            </w:pPr>
-            <w:r>
-              <w:rPr>
-                <w:b w:val="0"/>
-                <w:sz w:val="16"/>
-              </w:rPr>
-              <w:t>Technical Clarity</w:t>
-            </w:r>
-          </w:p>
-        </w:tc>
-        <w:tc>
-          <w:tcPr>
-            <w:tcW w:type="dxa" w:w="4392"/>
+            <w:tcW w:type="dxa" w:w="2736"/>
+            <w:vAlign w:val="center"/>
+          </w:tcPr>
+          <w:p>
+            <w:pPr>
+              <w:spacing w:before="0" w:after="0" w:line="240" w:lineRule="auto"/>
+            </w:pPr>
+            <w:r>
+              <w:rPr>
+                <w:b w:val="0"/>
+                <w:sz w:val="16"/>
+              </w:rPr>
+              <w:t>Technical Clarity: Interface will have the highest possible fidelity.</w:t>
+            </w:r>
+          </w:p>
+        </w:tc>
+        <w:tc>
+          <w:tcPr>
+            <w:tcW w:type="dxa" w:w="3528"/>
             <w:vAlign w:val="center"/>
           </w:tcPr>
           <w:p>
@@ -3031,7 +3018,7 @@
         </w:tc>
         <w:tc>
           <w:tcPr>
-            <w:tcW w:type="dxa" w:w="792"/>
+            <w:tcW w:type="dxa" w:w="1080"/>
             <w:vAlign w:val="center"/>
           </w:tcPr>
           <w:p>
@@ -3050,7 +3037,7 @@
         </w:tc>
         <w:tc>
           <w:tcPr>
-            <w:tcW w:type="dxa" w:w="3024"/>
+            <w:tcW w:type="dxa" w:w="2405"/>
             <w:vAlign w:val="center"/>
           </w:tcPr>
           <w:p>
@@ -3070,7 +3057,7 @@
       <w:tr>
         <w:tc>
           <w:tcPr>
-            <w:tcW w:type="dxa" w:w="461"/>
+            <w:tcW w:type="dxa" w:w="576"/>
             <w:vAlign w:val="center"/>
           </w:tcPr>
           <w:p>
@@ -3089,25 +3076,25 @@
         </w:tc>
         <w:tc>
           <w:tcPr>
-            <w:tcW w:type="dxa" w:w="1656"/>
-            <w:vAlign w:val="center"/>
-          </w:tcPr>
-          <w:p>
-            <w:pPr>
-              <w:spacing w:before="0" w:after="0" w:line="240" w:lineRule="auto"/>
-            </w:pPr>
-            <w:r>
-              <w:rPr>
-                <w:b w:val="0"/>
-                <w:sz w:val="16"/>
-              </w:rPr>
-              <w:t>Fulfillment</w:t>
-            </w:r>
-          </w:p>
-        </w:tc>
-        <w:tc>
-          <w:tcPr>
-            <w:tcW w:type="dxa" w:w="4392"/>
+            <w:tcW w:type="dxa" w:w="2736"/>
+            <w:vAlign w:val="center"/>
+          </w:tcPr>
+          <w:p>
+            <w:pPr>
+              <w:spacing w:before="0" w:after="0" w:line="240" w:lineRule="auto"/>
+            </w:pPr>
+            <w:r>
+              <w:rPr>
+                <w:b w:val="0"/>
+                <w:sz w:val="16"/>
+              </w:rPr>
+              <w:t>Fulfillment : The interface will provide a satisfying user experience</w:t>
+            </w:r>
+          </w:p>
+        </w:tc>
+        <w:tc>
+          <w:tcPr>
+            <w:tcW w:type="dxa" w:w="3528"/>
             <w:vAlign w:val="center"/>
           </w:tcPr>
           <w:p>
@@ -3125,7 +3112,7 @@
         </w:tc>
         <w:tc>
           <w:tcPr>
-            <w:tcW w:type="dxa" w:w="792"/>
+            <w:tcW w:type="dxa" w:w="1080"/>
             <w:vAlign w:val="center"/>
           </w:tcPr>
           <w:p>
@@ -3144,7 +3131,7 @@
         </w:tc>
         <w:tc>
           <w:tcPr>
-            <w:tcW w:type="dxa" w:w="3024"/>
+            <w:tcW w:type="dxa" w:w="2405"/>
             <w:vAlign w:val="center"/>
           </w:tcPr>
           <w:p>
@@ -3164,7 +3151,7 @@
       <w:tr>
         <w:tc>
           <w:tcPr>
-            <w:tcW w:type="dxa" w:w="461"/>
+            <w:tcW w:type="dxa" w:w="576"/>
             <w:vAlign w:val="center"/>
           </w:tcPr>
           <w:p>
@@ -3183,25 +3170,25 @@
         </w:tc>
         <w:tc>
           <w:tcPr>
-            <w:tcW w:type="dxa" w:w="1656"/>
-            <w:vAlign w:val="center"/>
-          </w:tcPr>
-          <w:p>
-            <w:pPr>
-              <w:spacing w:before="0" w:after="0" w:line="240" w:lineRule="auto"/>
-            </w:pPr>
-            <w:r>
-              <w:rPr>
-                <w:b w:val="0"/>
-                <w:sz w:val="16"/>
-              </w:rPr>
-              <w:t>Consistency</w:t>
-            </w:r>
-          </w:p>
-        </w:tc>
-        <w:tc>
-          <w:tcPr>
-            <w:tcW w:type="dxa" w:w="4392"/>
+            <w:tcW w:type="dxa" w:w="2736"/>
+            <w:vAlign w:val="center"/>
+          </w:tcPr>
+          <w:p>
+            <w:pPr>
+              <w:spacing w:before="0" w:after="0" w:line="240" w:lineRule="auto"/>
+            </w:pPr>
+            <w:r>
+              <w:rPr>
+                <w:b w:val="0"/>
+                <w:sz w:val="16"/>
+              </w:rPr>
+              <w:t>Consistency: Interface will be consistent</w:t>
+            </w:r>
+          </w:p>
+        </w:tc>
+        <w:tc>
+          <w:tcPr>
+            <w:tcW w:type="dxa" w:w="3528"/>
             <w:vAlign w:val="center"/>
           </w:tcPr>
           <w:p>
@@ -3219,7 +3206,7 @@
         </w:tc>
         <w:tc>
           <w:tcPr>
-            <w:tcW w:type="dxa" w:w="792"/>
+            <w:tcW w:type="dxa" w:w="1080"/>
             <w:vAlign w:val="center"/>
           </w:tcPr>
           <w:p>
@@ -3238,7 +3225,7 @@
         </w:tc>
         <w:tc>
           <w:tcPr>
-            <w:tcW w:type="dxa" w:w="3024"/>
+            <w:tcW w:type="dxa" w:w="2405"/>
             <w:vAlign w:val="center"/>
           </w:tcPr>
           <w:p>
@@ -3258,7 +3245,7 @@
       <w:tr>
         <w:tc>
           <w:tcPr>
-            <w:tcW w:type="dxa" w:w="461"/>
+            <w:tcW w:type="dxa" w:w="576"/>
             <w:vAlign w:val="center"/>
           </w:tcPr>
           <w:p>
@@ -3277,25 +3264,25 @@
         </w:tc>
         <w:tc>
           <w:tcPr>
-            <w:tcW w:type="dxa" w:w="1656"/>
-            <w:vAlign w:val="center"/>
-          </w:tcPr>
-          <w:p>
-            <w:pPr>
-              <w:spacing w:before="0" w:after="0" w:line="240" w:lineRule="auto"/>
-            </w:pPr>
-            <w:r>
-              <w:rPr>
-                <w:b w:val="0"/>
-                <w:sz w:val="16"/>
-              </w:rPr>
-              <w:t>User Support</w:t>
-            </w:r>
-          </w:p>
-        </w:tc>
-        <w:tc>
-          <w:tcPr>
-            <w:tcW w:type="dxa" w:w="4392"/>
+            <w:tcW w:type="dxa" w:w="2736"/>
+            <w:vAlign w:val="center"/>
+          </w:tcPr>
+          <w:p>
+            <w:pPr>
+              <w:spacing w:before="0" w:after="0" w:line="240" w:lineRule="auto"/>
+            </w:pPr>
+            <w:r>
+              <w:rPr>
+                <w:b w:val="0"/>
+                <w:sz w:val="16"/>
+              </w:rPr>
+              <w:t>User Support: Interface will provide additional assistance as needed or requested</w:t>
+            </w:r>
+          </w:p>
+        </w:tc>
+        <w:tc>
+          <w:tcPr>
+            <w:tcW w:type="dxa" w:w="3528"/>
             <w:vAlign w:val="center"/>
           </w:tcPr>
           <w:p>
@@ -3313,7 +3300,7 @@
         </w:tc>
         <w:tc>
           <w:tcPr>
-            <w:tcW w:type="dxa" w:w="792"/>
+            <w:tcW w:type="dxa" w:w="1080"/>
             <w:vAlign w:val="center"/>
           </w:tcPr>
           <w:p>
@@ -3332,7 +3319,7 @@
         </w:tc>
         <w:tc>
           <w:tcPr>
-            <w:tcW w:type="dxa" w:w="3024"/>
+            <w:tcW w:type="dxa" w:w="2405"/>
             <w:vAlign w:val="center"/>
           </w:tcPr>
           <w:p>
@@ -3352,7 +3339,7 @@
       <w:tr>
         <w:tc>
           <w:tcPr>
-            <w:tcW w:type="dxa" w:w="461"/>
+            <w:tcW w:type="dxa" w:w="576"/>
             <w:vAlign w:val="center"/>
           </w:tcPr>
           <w:p>
@@ -3371,25 +3358,25 @@
         </w:tc>
         <w:tc>
           <w:tcPr>
-            <w:tcW w:type="dxa" w:w="1656"/>
-            <w:vAlign w:val="center"/>
-          </w:tcPr>
-          <w:p>
-            <w:pPr>
-              <w:spacing w:before="0" w:after="0" w:line="240" w:lineRule="auto"/>
-            </w:pPr>
-            <w:r>
-              <w:rPr>
-                <w:b w:val="0"/>
-                <w:sz w:val="16"/>
-              </w:rPr>
-              <w:t>Precision</w:t>
-            </w:r>
-          </w:p>
-        </w:tc>
-        <w:tc>
-          <w:tcPr>
-            <w:tcW w:type="dxa" w:w="4392"/>
+            <w:tcW w:type="dxa" w:w="2736"/>
+            <w:vAlign w:val="center"/>
+          </w:tcPr>
+          <w:p>
+            <w:pPr>
+              <w:spacing w:before="0" w:after="0" w:line="240" w:lineRule="auto"/>
+            </w:pPr>
+            <w:r>
+              <w:rPr>
+                <w:b w:val="0"/>
+                <w:sz w:val="16"/>
+              </w:rPr>
+              <w:t>Precision: The interface will allow the users to perform a task exactly</w:t>
+            </w:r>
+          </w:p>
+        </w:tc>
+        <w:tc>
+          <w:tcPr>
+            <w:tcW w:type="dxa" w:w="3528"/>
             <w:vAlign w:val="center"/>
           </w:tcPr>
           <w:p>
@@ -3407,7 +3394,7 @@
         </w:tc>
         <w:tc>
           <w:tcPr>
-            <w:tcW w:type="dxa" w:w="792"/>
+            <w:tcW w:type="dxa" w:w="1080"/>
             <w:vAlign w:val="center"/>
           </w:tcPr>
           <w:p>
@@ -3426,7 +3413,7 @@
         </w:tc>
         <w:tc>
           <w:tcPr>
-            <w:tcW w:type="dxa" w:w="3024"/>
+            <w:tcW w:type="dxa" w:w="2405"/>
             <w:vAlign w:val="center"/>
           </w:tcPr>
           <w:p>
@@ -3446,7 +3433,7 @@
       <w:tr>
         <w:tc>
           <w:tcPr>
-            <w:tcW w:type="dxa" w:w="461"/>
+            <w:tcW w:type="dxa" w:w="576"/>
             <w:vAlign w:val="center"/>
           </w:tcPr>
           <w:p>
@@ -3465,25 +3452,25 @@
         </w:tc>
         <w:tc>
           <w:tcPr>
-            <w:tcW w:type="dxa" w:w="1656"/>
-            <w:vAlign w:val="center"/>
-          </w:tcPr>
-          <w:p>
-            <w:pPr>
-              <w:spacing w:before="0" w:after="0" w:line="240" w:lineRule="auto"/>
-            </w:pPr>
-            <w:r>
-              <w:rPr>
-                <w:b w:val="0"/>
-                <w:sz w:val="16"/>
-              </w:rPr>
-              <w:t>Forgiveness</w:t>
-            </w:r>
-          </w:p>
-        </w:tc>
-        <w:tc>
-          <w:tcPr>
-            <w:tcW w:type="dxa" w:w="4392"/>
+            <w:tcW w:type="dxa" w:w="2736"/>
+            <w:vAlign w:val="center"/>
+          </w:tcPr>
+          <w:p>
+            <w:pPr>
+              <w:spacing w:before="0" w:after="0" w:line="240" w:lineRule="auto"/>
+            </w:pPr>
+            <w:r>
+              <w:rPr>
+                <w:b w:val="0"/>
+                <w:sz w:val="16"/>
+              </w:rPr>
+              <w:t>Forgiveness: Interface will make action recoverable</w:t>
+            </w:r>
+          </w:p>
+        </w:tc>
+        <w:tc>
+          <w:tcPr>
+            <w:tcW w:type="dxa" w:w="3528"/>
             <w:vAlign w:val="center"/>
           </w:tcPr>
           <w:p>
@@ -3501,7 +3488,7 @@
         </w:tc>
         <w:tc>
           <w:tcPr>
-            <w:tcW w:type="dxa" w:w="792"/>
+            <w:tcW w:type="dxa" w:w="1080"/>
             <w:vAlign w:val="center"/>
           </w:tcPr>
           <w:p>
@@ -3520,7 +3507,7 @@
         </w:tc>
         <w:tc>
           <w:tcPr>
-            <w:tcW w:type="dxa" w:w="3024"/>
+            <w:tcW w:type="dxa" w:w="2405"/>
             <w:vAlign w:val="center"/>
           </w:tcPr>
           <w:p>
@@ -3540,7 +3527,7 @@
       <w:tr>
         <w:tc>
           <w:tcPr>
-            <w:tcW w:type="dxa" w:w="461"/>
+            <w:tcW w:type="dxa" w:w="576"/>
             <w:vAlign w:val="center"/>
           </w:tcPr>
           <w:p>
@@ -3559,25 +3546,25 @@
         </w:tc>
         <w:tc>
           <w:tcPr>
-            <w:tcW w:type="dxa" w:w="1656"/>
-            <w:vAlign w:val="center"/>
-          </w:tcPr>
-          <w:p>
-            <w:pPr>
-              <w:spacing w:before="0" w:after="0" w:line="240" w:lineRule="auto"/>
-            </w:pPr>
-            <w:r>
-              <w:rPr>
-                <w:b w:val="0"/>
-                <w:sz w:val="16"/>
-              </w:rPr>
-              <w:t>Responsiveness</w:t>
-            </w:r>
-          </w:p>
-        </w:tc>
-        <w:tc>
-          <w:tcPr>
-            <w:tcW w:type="dxa" w:w="4392"/>
+            <w:tcW w:type="dxa" w:w="2736"/>
+            <w:vAlign w:val="center"/>
+          </w:tcPr>
+          <w:p>
+            <w:pPr>
+              <w:spacing w:before="0" w:after="0" w:line="240" w:lineRule="auto"/>
+            </w:pPr>
+            <w:r>
+              <w:rPr>
+                <w:b w:val="0"/>
+                <w:sz w:val="16"/>
+              </w:rPr>
+              <w:t>Responsiveness: The interface will inform users about the results of their actions and their interface status</w:t>
+            </w:r>
+          </w:p>
+        </w:tc>
+        <w:tc>
+          <w:tcPr>
+            <w:tcW w:type="dxa" w:w="3528"/>
             <w:vAlign w:val="center"/>
           </w:tcPr>
           <w:p>
@@ -3595,7 +3582,7 @@
         </w:tc>
         <w:tc>
           <w:tcPr>
-            <w:tcW w:type="dxa" w:w="792"/>
+            <w:tcW w:type="dxa" w:w="1080"/>
             <w:vAlign w:val="center"/>
           </w:tcPr>
           <w:p>
@@ -3614,7 +3601,7 @@
         </w:tc>
         <w:tc>
           <w:tcPr>
-            <w:tcW w:type="dxa" w:w="3024"/>
+            <w:tcW w:type="dxa" w:w="2405"/>
             <w:vAlign w:val="center"/>
           </w:tcPr>
           <w:p>
@@ -3634,25 +3621,25 @@
       <w:tr>
         <w:tc>
           <w:tcPr>
-            <w:tcW w:type="dxa" w:w="461"/>
-            <w:vAlign w:val="center"/>
-          </w:tcPr>
-          <w:p>
-            <w:pPr>
-              <w:spacing w:before="0" w:after="0" w:line="240" w:lineRule="auto"/>
-              <w:jc w:val="center"/>
-            </w:pPr>
-            <w:r>
-              <w:rPr>
-                <w:b/>
-                <w:sz w:val="16"/>
-              </w:rPr>
-            </w:r>
-          </w:p>
-        </w:tc>
-        <w:tc>
-          <w:tcPr>
-            <w:tcW w:type="dxa" w:w="1656"/>
+            <w:tcW w:type="dxa" w:w="576"/>
+            <w:vAlign w:val="center"/>
+          </w:tcPr>
+          <w:p>
+            <w:pPr>
+              <w:spacing w:before="0" w:after="0" w:line="240" w:lineRule="auto"/>
+              <w:jc w:val="center"/>
+            </w:pPr>
+            <w:r>
+              <w:rPr>
+                <w:b/>
+                <w:sz w:val="16"/>
+              </w:rPr>
+            </w:r>
+          </w:p>
+        </w:tc>
+        <w:tc>
+          <w:tcPr>
+            <w:tcW w:type="dxa" w:w="2736"/>
             <w:vAlign w:val="center"/>
           </w:tcPr>
           <w:p>
@@ -3670,24 +3657,24 @@
         </w:tc>
         <w:tc>
           <w:tcPr>
-            <w:tcW w:type="dxa" w:w="4392"/>
-            <w:vAlign w:val="center"/>
-          </w:tcPr>
-          <w:p>
-            <w:pPr>
-              <w:spacing w:before="0" w:after="0" w:line="240" w:lineRule="auto"/>
-            </w:pPr>
-            <w:r>
-              <w:rPr>
-                <w:b/>
-                <w:sz w:val="16"/>
-              </w:rPr>
-            </w:r>
-          </w:p>
-        </w:tc>
-        <w:tc>
-          <w:tcPr>
-            <w:tcW w:type="dxa" w:w="792"/>
+            <w:tcW w:type="dxa" w:w="3528"/>
+            <w:vAlign w:val="center"/>
+          </w:tcPr>
+          <w:p>
+            <w:pPr>
+              <w:spacing w:before="0" w:after="0" w:line="240" w:lineRule="auto"/>
+            </w:pPr>
+            <w:r>
+              <w:rPr>
+                <w:b/>
+                <w:sz w:val="16"/>
+              </w:rPr>
+            </w:r>
+          </w:p>
+        </w:tc>
+        <w:tc>
+          <w:tcPr>
+            <w:tcW w:type="dxa" w:w="1080"/>
             <w:vAlign w:val="center"/>
           </w:tcPr>
           <w:p>
@@ -3706,7 +3693,7 @@
         </w:tc>
         <w:tc>
           <w:tcPr>
-            <w:tcW w:type="dxa" w:w="3024"/>
+            <w:tcW w:type="dxa" w:w="2405"/>
             <w:vAlign w:val="center"/>
           </w:tcPr>
           <w:p>
@@ -3760,19 +3747,18 @@
           <w:tcPr>
             <w:tcW w:type="dxa" w:w="576"/>
             <w:vAlign w:val="center"/>
-            <w:shd w:val="clear" w:color="auto" w:fill="D9E2DC"/>
-          </w:tcPr>
-          <w:p>
-            <w:pPr>
-              <w:spacing w:before="0" w:after="0" w:line="240" w:lineRule="auto"/>
-              <w:jc w:val="center"/>
-            </w:pPr>
-            <w:r>
-              <w:rPr>
-                <w:b/>
-                <w:sz w:val="16"/>
-              </w:rPr>
-              <w:t>No.</w:t>
+          </w:tcPr>
+          <w:p>
+            <w:pPr>
+              <w:spacing w:before="0" w:after="0" w:line="240" w:lineRule="auto"/>
+              <w:jc w:val="center"/>
+            </w:pPr>
+            <w:r>
+              <w:rPr>
+                <w:b/>
+                <w:sz w:val="16"/>
+              </w:rPr>
+              <w:t>S.NO</w:t>
             </w:r>
           </w:p>
         </w:tc>
@@ -3780,18 +3766,17 @@
           <w:tcPr>
             <w:tcW w:type="dxa" w:w="5112"/>
             <w:vAlign w:val="center"/>
-            <w:shd w:val="clear" w:color="auto" w:fill="D9E2DC"/>
-          </w:tcPr>
-          <w:p>
-            <w:pPr>
-              <w:spacing w:before="0" w:after="0" w:line="240" w:lineRule="auto"/>
-            </w:pPr>
-            <w:r>
-              <w:rPr>
-                <w:b/>
-                <w:sz w:val="16"/>
-              </w:rPr>
-              <w:t>Observations</w:t>
+          </w:tcPr>
+          <w:p>
+            <w:pPr>
+              <w:spacing w:before="0" w:after="0" w:line="240" w:lineRule="auto"/>
+            </w:pPr>
+            <w:r>
+              <w:rPr>
+                <w:b/>
+                <w:sz w:val="16"/>
+              </w:rPr>
+              <w:t>OBSERVATIONS</w:t>
             </w:r>
           </w:p>
         </w:tc>
@@ -3799,18 +3784,17 @@
           <w:tcPr>
             <w:tcW w:type="dxa" w:w="4637"/>
             <w:vAlign w:val="center"/>
-            <w:shd w:val="clear" w:color="auto" w:fill="D9E2DC"/>
-          </w:tcPr>
-          <w:p>
-            <w:pPr>
-              <w:spacing w:before="0" w:after="0" w:line="240" w:lineRule="auto"/>
-            </w:pPr>
-            <w:r>
-              <w:rPr>
-                <w:b/>
-                <w:sz w:val="16"/>
-              </w:rPr>
-              <w:t>Comments</w:t>
+          </w:tcPr>
+          <w:p>
+            <w:pPr>
+              <w:spacing w:before="0" w:after="0" w:line="240" w:lineRule="auto"/>
+            </w:pPr>
+            <w:r>
+              <w:rPr>
+                <w:b/>
+                <w:sz w:val="16"/>
+              </w:rPr>
+              <w:t>COMMENTS</w:t>
             </w:r>
           </w:p>
         </w:tc>
@@ -4089,96 +4073,91 @@
         <w:tblLayout w:type="fixed"/>
       </w:tblPr>
       <w:tblGrid>
-        <w:gridCol w:w="460"/>
-        <w:gridCol w:w="1655"/>
-        <w:gridCol w:w="4392"/>
-        <w:gridCol w:w="792"/>
-        <w:gridCol w:w="3024"/>
+        <w:gridCol w:w="576"/>
+        <w:gridCol w:w="2736"/>
+        <w:gridCol w:w="3528"/>
+        <w:gridCol w:w="1080"/>
+        <w:gridCol w:w="2404"/>
       </w:tblGrid>
       <w:tr>
         <w:tc>
           <w:tcPr>
-            <w:tcW w:type="dxa" w:w="461"/>
-            <w:vAlign w:val="center"/>
-            <w:shd w:val="clear" w:color="auto" w:fill="D9E2DC"/>
-          </w:tcPr>
-          <w:p>
-            <w:pPr>
-              <w:spacing w:before="0" w:after="0" w:line="240" w:lineRule="auto"/>
-              <w:jc w:val="center"/>
-            </w:pPr>
-            <w:r>
-              <w:rPr>
-                <w:b/>
-                <w:sz w:val="16"/>
-              </w:rPr>
-              <w:t>No.</w:t>
-            </w:r>
-          </w:p>
-        </w:tc>
-        <w:tc>
-          <w:tcPr>
-            <w:tcW w:type="dxa" w:w="1656"/>
-            <w:vAlign w:val="center"/>
-            <w:shd w:val="clear" w:color="auto" w:fill="D9E2DC"/>
-          </w:tcPr>
-          <w:p>
-            <w:pPr>
-              <w:spacing w:before="0" w:after="0" w:line="240" w:lineRule="auto"/>
-            </w:pPr>
-            <w:r>
-              <w:rPr>
-                <w:b/>
-                <w:sz w:val="16"/>
-              </w:rPr>
-              <w:t>Heuristic</w:t>
-            </w:r>
-          </w:p>
-        </w:tc>
-        <w:tc>
-          <w:tcPr>
-            <w:tcW w:type="dxa" w:w="4392"/>
-            <w:vAlign w:val="center"/>
-            <w:shd w:val="clear" w:color="auto" w:fill="D9E2DC"/>
-          </w:tcPr>
-          <w:p>
-            <w:pPr>
-              <w:spacing w:before="0" w:after="0" w:line="240" w:lineRule="auto"/>
-            </w:pPr>
-            <w:r>
-              <w:rPr>
-                <w:b/>
-                <w:sz w:val="16"/>
-              </w:rPr>
-              <w:t>Violation (if any)</w:t>
-            </w:r>
-          </w:p>
-        </w:tc>
-        <w:tc>
-          <w:tcPr>
-            <w:tcW w:type="dxa" w:w="792"/>
-            <w:vAlign w:val="center"/>
-            <w:shd w:val="clear" w:color="auto" w:fill="D9E2DC"/>
-          </w:tcPr>
-          <w:p>
-            <w:pPr>
-              <w:spacing w:before="0" w:after="0" w:line="240" w:lineRule="auto"/>
-              <w:jc w:val="center"/>
-            </w:pPr>
-            <w:r>
-              <w:rPr>
-                <w:b/>
-                <w:sz w:val="16"/>
-              </w:rPr>
-              <w:t>Severity (0-5)</w:t>
-            </w:r>
-          </w:p>
-        </w:tc>
-        <w:tc>
-          <w:tcPr>
-            <w:tcW w:type="dxa" w:w="3024"/>
-            <w:vAlign w:val="center"/>
-            <w:shd w:val="clear" w:color="auto" w:fill="D9E2DC"/>
+            <w:tcW w:type="dxa" w:w="576"/>
+            <w:vAlign w:val="center"/>
+          </w:tcPr>
+          <w:p>
+            <w:pPr>
+              <w:spacing w:before="0" w:after="0" w:line="240" w:lineRule="auto"/>
+              <w:jc w:val="center"/>
+            </w:pPr>
+            <w:r>
+              <w:rPr>
+                <w:b/>
+                <w:sz w:val="16"/>
+              </w:rPr>
+              <w:t>S.No.</w:t>
+            </w:r>
+          </w:p>
+        </w:tc>
+        <w:tc>
+          <w:tcPr>
+            <w:tcW w:type="dxa" w:w="2736"/>
+            <w:vAlign w:val="center"/>
+          </w:tcPr>
+          <w:p>
+            <w:pPr>
+              <w:spacing w:before="0" w:after="0" w:line="240" w:lineRule="auto"/>
+            </w:pPr>
+            <w:r>
+              <w:rPr>
+                <w:b/>
+                <w:sz w:val="16"/>
+              </w:rPr>
+              <w:t>Heuristic Evaluation Parameter</w:t>
+            </w:r>
+          </w:p>
+        </w:tc>
+        <w:tc>
+          <w:tcPr>
+            <w:tcW w:type="dxa" w:w="3528"/>
+            <w:vAlign w:val="center"/>
+          </w:tcPr>
+          <w:p>
+            <w:pPr>
+              <w:spacing w:before="0" w:after="0" w:line="240" w:lineRule="auto"/>
+            </w:pPr>
+            <w:r>
+              <w:rPr>
+                <w:b/>
+                <w:sz w:val="16"/>
+              </w:rPr>
+              <w:t>Mention Violation if any</w:t>
+            </w:r>
+          </w:p>
+        </w:tc>
+        <w:tc>
+          <w:tcPr>
+            <w:tcW w:type="dxa" w:w="1080"/>
+            <w:vAlign w:val="center"/>
+          </w:tcPr>
+          <w:p>
+            <w:pPr>
+              <w:spacing w:before="0" w:after="0" w:line="240" w:lineRule="auto"/>
+              <w:jc w:val="center"/>
+            </w:pPr>
+            <w:r>
+              <w:rPr>
+                <w:b/>
+                <w:sz w:val="16"/>
+              </w:rPr>
+              <w:t>Severity  0-5 (0- minimum and 5 is maximium)</w:t>
+            </w:r>
+          </w:p>
+        </w:tc>
+        <w:tc>
+          <w:tcPr>
+            <w:tcW w:type="dxa" w:w="2405"/>
+            <w:vAlign w:val="center"/>
           </w:tcPr>
           <w:p>
             <w:pPr>
@@ -4197,7 +4176,7 @@
       <w:tr>
         <w:tc>
           <w:tcPr>
-            <w:tcW w:type="dxa" w:w="461"/>
+            <w:tcW w:type="dxa" w:w="576"/>
             <w:vAlign w:val="center"/>
           </w:tcPr>
           <w:p>
@@ -4216,25 +4195,25 @@
         </w:tc>
         <w:tc>
           <w:tcPr>
-            <w:tcW w:type="dxa" w:w="1656"/>
-            <w:vAlign w:val="center"/>
-          </w:tcPr>
-          <w:p>
-            <w:pPr>
-              <w:spacing w:before="0" w:after="0" w:line="240" w:lineRule="auto"/>
-            </w:pPr>
-            <w:r>
-              <w:rPr>
-                <w:b w:val="0"/>
-                <w:sz w:val="16"/>
-              </w:rPr>
-              <w:t>User Control</w:t>
-            </w:r>
-          </w:p>
-        </w:tc>
-        <w:tc>
-          <w:tcPr>
-            <w:tcW w:type="dxa" w:w="4392"/>
+            <w:tcW w:type="dxa" w:w="2736"/>
+            <w:vAlign w:val="center"/>
+          </w:tcPr>
+          <w:p>
+            <w:pPr>
+              <w:spacing w:before="0" w:after="0" w:line="240" w:lineRule="auto"/>
+            </w:pPr>
+            <w:r>
+              <w:rPr>
+                <w:b w:val="0"/>
+                <w:sz w:val="16"/>
+              </w:rPr>
+              <w:t>User Control: Interface will allow the user to perceive that they are in control</w:t>
+            </w:r>
+          </w:p>
+        </w:tc>
+        <w:tc>
+          <w:tcPr>
+            <w:tcW w:type="dxa" w:w="3528"/>
             <w:vAlign w:val="center"/>
           </w:tcPr>
           <w:p>
@@ -4252,7 +4231,7 @@
         </w:tc>
         <w:tc>
           <w:tcPr>
-            <w:tcW w:type="dxa" w:w="792"/>
+            <w:tcW w:type="dxa" w:w="1080"/>
             <w:vAlign w:val="center"/>
           </w:tcPr>
           <w:p>
@@ -4271,7 +4250,7 @@
         </w:tc>
         <w:tc>
           <w:tcPr>
-            <w:tcW w:type="dxa" w:w="3024"/>
+            <w:tcW w:type="dxa" w:w="2405"/>
             <w:vAlign w:val="center"/>
           </w:tcPr>
           <w:p>
@@ -4291,7 +4270,7 @@
       <w:tr>
         <w:tc>
           <w:tcPr>
-            <w:tcW w:type="dxa" w:w="461"/>
+            <w:tcW w:type="dxa" w:w="576"/>
             <w:vAlign w:val="center"/>
           </w:tcPr>
           <w:p>
@@ -4310,25 +4289,25 @@
         </w:tc>
         <w:tc>
           <w:tcPr>
-            <w:tcW w:type="dxa" w:w="1656"/>
-            <w:vAlign w:val="center"/>
-          </w:tcPr>
-          <w:p>
-            <w:pPr>
-              <w:spacing w:before="0" w:after="0" w:line="240" w:lineRule="auto"/>
-            </w:pPr>
-            <w:r>
-              <w:rPr>
-                <w:b w:val="0"/>
-                <w:sz w:val="16"/>
-              </w:rPr>
-              <w:t>Human Limitations</w:t>
-            </w:r>
-          </w:p>
-        </w:tc>
-        <w:tc>
-          <w:tcPr>
-            <w:tcW w:type="dxa" w:w="4392"/>
+            <w:tcW w:type="dxa" w:w="2736"/>
+            <w:vAlign w:val="center"/>
+          </w:tcPr>
+          <w:p>
+            <w:pPr>
+              <w:spacing w:before="0" w:after="0" w:line="240" w:lineRule="auto"/>
+            </w:pPr>
+            <w:r>
+              <w:rPr>
+                <w:b w:val="0"/>
+                <w:sz w:val="16"/>
+              </w:rPr>
+              <w:t>Human Limitations: Interface will not overload the users cognitive, auditory and motor skills</w:t>
+            </w:r>
+          </w:p>
+        </w:tc>
+        <w:tc>
+          <w:tcPr>
+            <w:tcW w:type="dxa" w:w="3528"/>
             <w:vAlign w:val="center"/>
           </w:tcPr>
           <w:p>
@@ -4346,7 +4325,7 @@
         </w:tc>
         <w:tc>
           <w:tcPr>
-            <w:tcW w:type="dxa" w:w="792"/>
+            <w:tcW w:type="dxa" w:w="1080"/>
             <w:vAlign w:val="center"/>
           </w:tcPr>
           <w:p>
@@ -4365,7 +4344,7 @@
         </w:tc>
         <w:tc>
           <w:tcPr>
-            <w:tcW w:type="dxa" w:w="3024"/>
+            <w:tcW w:type="dxa" w:w="2405"/>
             <w:vAlign w:val="center"/>
           </w:tcPr>
           <w:p>
@@ -4385,7 +4364,7 @@
       <w:tr>
         <w:tc>
           <w:tcPr>
-            <w:tcW w:type="dxa" w:w="461"/>
+            <w:tcW w:type="dxa" w:w="576"/>
             <w:vAlign w:val="center"/>
           </w:tcPr>
           <w:p>
@@ -4404,25 +4383,25 @@
         </w:tc>
         <w:tc>
           <w:tcPr>
-            <w:tcW w:type="dxa" w:w="1656"/>
-            <w:vAlign w:val="center"/>
-          </w:tcPr>
-          <w:p>
-            <w:pPr>
-              <w:spacing w:before="0" w:after="0" w:line="240" w:lineRule="auto"/>
-            </w:pPr>
-            <w:r>
-              <w:rPr>
-                <w:b w:val="0"/>
-                <w:sz w:val="16"/>
-              </w:rPr>
-              <w:t>Accommodation</w:t>
-            </w:r>
-          </w:p>
-        </w:tc>
-        <w:tc>
-          <w:tcPr>
-            <w:tcW w:type="dxa" w:w="4392"/>
+            <w:tcW w:type="dxa" w:w="2736"/>
+            <w:vAlign w:val="center"/>
+          </w:tcPr>
+          <w:p>
+            <w:pPr>
+              <w:spacing w:before="0" w:after="0" w:line="240" w:lineRule="auto"/>
+            </w:pPr>
+            <w:r>
+              <w:rPr>
+                <w:b w:val="0"/>
+                <w:sz w:val="16"/>
+              </w:rPr>
+              <w:t>Accommodation: The interface will fit the way each user group works and thinks (personas)</w:t>
+            </w:r>
+          </w:p>
+        </w:tc>
+        <w:tc>
+          <w:tcPr>
+            <w:tcW w:type="dxa" w:w="3528"/>
             <w:vAlign w:val="center"/>
           </w:tcPr>
           <w:p>
@@ -4440,7 +4419,7 @@
         </w:tc>
         <w:tc>
           <w:tcPr>
-            <w:tcW w:type="dxa" w:w="792"/>
+            <w:tcW w:type="dxa" w:w="1080"/>
             <w:vAlign w:val="center"/>
           </w:tcPr>
           <w:p>
@@ -4459,7 +4438,7 @@
         </w:tc>
         <w:tc>
           <w:tcPr>
-            <w:tcW w:type="dxa" w:w="3024"/>
+            <w:tcW w:type="dxa" w:w="2405"/>
             <w:vAlign w:val="center"/>
           </w:tcPr>
           <w:p>
@@ -4479,7 +4458,7 @@
       <w:tr>
         <w:tc>
           <w:tcPr>
-            <w:tcW w:type="dxa" w:w="461"/>
+            <w:tcW w:type="dxa" w:w="576"/>
             <w:vAlign w:val="center"/>
           </w:tcPr>
           <w:p>
@@ -4498,25 +4477,25 @@
         </w:tc>
         <w:tc>
           <w:tcPr>
-            <w:tcW w:type="dxa" w:w="1656"/>
-            <w:vAlign w:val="center"/>
-          </w:tcPr>
-          <w:p>
-            <w:pPr>
-              <w:spacing w:before="0" w:after="0" w:line="240" w:lineRule="auto"/>
-            </w:pPr>
-            <w:r>
-              <w:rPr>
-                <w:b w:val="0"/>
-                <w:sz w:val="16"/>
-              </w:rPr>
-              <w:t>Linguistic Clarity</w:t>
-            </w:r>
-          </w:p>
-        </w:tc>
-        <w:tc>
-          <w:tcPr>
-            <w:tcW w:type="dxa" w:w="4392"/>
+            <w:tcW w:type="dxa" w:w="2736"/>
+            <w:vAlign w:val="center"/>
+          </w:tcPr>
+          <w:p>
+            <w:pPr>
+              <w:spacing w:before="0" w:after="0" w:line="240" w:lineRule="auto"/>
+            </w:pPr>
+            <w:r>
+              <w:rPr>
+                <w:b w:val="0"/>
+                <w:sz w:val="16"/>
+              </w:rPr>
+              <w:t>Linguistic Clarity: Interface will communicate as efficiently as possible</w:t>
+            </w:r>
+          </w:p>
+        </w:tc>
+        <w:tc>
+          <w:tcPr>
+            <w:tcW w:type="dxa" w:w="3528"/>
             <w:vAlign w:val="center"/>
           </w:tcPr>
           <w:p>
@@ -4534,7 +4513,7 @@
         </w:tc>
         <w:tc>
           <w:tcPr>
-            <w:tcW w:type="dxa" w:w="792"/>
+            <w:tcW w:type="dxa" w:w="1080"/>
             <w:vAlign w:val="center"/>
           </w:tcPr>
           <w:p>
@@ -4553,7 +4532,7 @@
         </w:tc>
         <w:tc>
           <w:tcPr>
-            <w:tcW w:type="dxa" w:w="3024"/>
+            <w:tcW w:type="dxa" w:w="2405"/>
             <w:vAlign w:val="center"/>
           </w:tcPr>
           <w:p>
@@ -4573,7 +4552,7 @@
       <w:tr>
         <w:tc>
           <w:tcPr>
-            <w:tcW w:type="dxa" w:w="461"/>
+            <w:tcW w:type="dxa" w:w="576"/>
             <w:vAlign w:val="center"/>
           </w:tcPr>
           <w:p>
@@ -4592,25 +4571,25 @@
         </w:tc>
         <w:tc>
           <w:tcPr>
-            <w:tcW w:type="dxa" w:w="1656"/>
-            <w:vAlign w:val="center"/>
-          </w:tcPr>
-          <w:p>
-            <w:pPr>
-              <w:spacing w:before="0" w:after="0" w:line="240" w:lineRule="auto"/>
-            </w:pPr>
-            <w:r>
-              <w:rPr>
-                <w:b w:val="0"/>
-                <w:sz w:val="16"/>
-              </w:rPr>
-              <w:t>Aesthetic Integrity</w:t>
-            </w:r>
-          </w:p>
-        </w:tc>
-        <w:tc>
-          <w:tcPr>
-            <w:tcW w:type="dxa" w:w="4392"/>
+            <w:tcW w:type="dxa" w:w="2736"/>
+            <w:vAlign w:val="center"/>
+          </w:tcPr>
+          <w:p>
+            <w:pPr>
+              <w:spacing w:before="0" w:after="0" w:line="240" w:lineRule="auto"/>
+            </w:pPr>
+            <w:r>
+              <w:rPr>
+                <w:b w:val="0"/>
+                <w:sz w:val="16"/>
+              </w:rPr>
+              <w:t>Aesthetic Integrity :The interface will have an attractive and appropriate design</w:t>
+            </w:r>
+          </w:p>
+        </w:tc>
+        <w:tc>
+          <w:tcPr>
+            <w:tcW w:type="dxa" w:w="3528"/>
             <w:vAlign w:val="center"/>
           </w:tcPr>
           <w:p>
@@ -4628,7 +4607,7 @@
         </w:tc>
         <w:tc>
           <w:tcPr>
-            <w:tcW w:type="dxa" w:w="792"/>
+            <w:tcW w:type="dxa" w:w="1080"/>
             <w:vAlign w:val="center"/>
           </w:tcPr>
           <w:p>
@@ -4647,7 +4626,7 @@
         </w:tc>
         <w:tc>
           <w:tcPr>
-            <w:tcW w:type="dxa" w:w="3024"/>
+            <w:tcW w:type="dxa" w:w="2405"/>
             <w:vAlign w:val="center"/>
           </w:tcPr>
           <w:p>
@@ -4667,7 +4646,7 @@
       <w:tr>
         <w:tc>
           <w:tcPr>
-            <w:tcW w:type="dxa" w:w="461"/>
+            <w:tcW w:type="dxa" w:w="576"/>
             <w:vAlign w:val="center"/>
           </w:tcPr>
           <w:p>
@@ -4686,25 +4665,25 @@
         </w:tc>
         <w:tc>
           <w:tcPr>
-            <w:tcW w:type="dxa" w:w="1656"/>
-            <w:vAlign w:val="center"/>
-          </w:tcPr>
-          <w:p>
-            <w:pPr>
-              <w:spacing w:before="0" w:after="0" w:line="240" w:lineRule="auto"/>
-            </w:pPr>
-            <w:r>
-              <w:rPr>
-                <w:b w:val="0"/>
-                <w:sz w:val="16"/>
-              </w:rPr>
-              <w:t>Simplicity</w:t>
-            </w:r>
-          </w:p>
-        </w:tc>
-        <w:tc>
-          <w:tcPr>
-            <w:tcW w:type="dxa" w:w="4392"/>
+            <w:tcW w:type="dxa" w:w="2736"/>
+            <w:vAlign w:val="center"/>
+          </w:tcPr>
+          <w:p>
+            <w:pPr>
+              <w:spacing w:before="0" w:after="0" w:line="240" w:lineRule="auto"/>
+            </w:pPr>
+            <w:r>
+              <w:rPr>
+                <w:b w:val="0"/>
+                <w:sz w:val="16"/>
+              </w:rPr>
+              <w:t>Simplicity: The interface will have a simple design</w:t>
+            </w:r>
+          </w:p>
+        </w:tc>
+        <w:tc>
+          <w:tcPr>
+            <w:tcW w:type="dxa" w:w="3528"/>
             <w:vAlign w:val="center"/>
           </w:tcPr>
           <w:p>
@@ -4722,7 +4701,7 @@
         </w:tc>
         <w:tc>
           <w:tcPr>
-            <w:tcW w:type="dxa" w:w="792"/>
+            <w:tcW w:type="dxa" w:w="1080"/>
             <w:vAlign w:val="center"/>
           </w:tcPr>
           <w:p>
@@ -4741,7 +4720,7 @@
         </w:tc>
         <w:tc>
           <w:tcPr>
-            <w:tcW w:type="dxa" w:w="3024"/>
+            <w:tcW w:type="dxa" w:w="2405"/>
             <w:vAlign w:val="center"/>
           </w:tcPr>
           <w:p>
@@ -4761,7 +4740,7 @@
       <w:tr>
         <w:tc>
           <w:tcPr>
-            <w:tcW w:type="dxa" w:w="461"/>
+            <w:tcW w:type="dxa" w:w="576"/>
             <w:vAlign w:val="center"/>
           </w:tcPr>
           <w:p>
@@ -4780,25 +4759,25 @@
         </w:tc>
         <w:tc>
           <w:tcPr>
-            <w:tcW w:type="dxa" w:w="1656"/>
-            <w:vAlign w:val="center"/>
-          </w:tcPr>
-          <w:p>
-            <w:pPr>
-              <w:spacing w:before="0" w:after="0" w:line="240" w:lineRule="auto"/>
-            </w:pPr>
-            <w:r>
-              <w:rPr>
-                <w:b w:val="0"/>
-                <w:sz w:val="16"/>
-              </w:rPr>
-              <w:t>Predictability</w:t>
-            </w:r>
-          </w:p>
-        </w:tc>
-        <w:tc>
-          <w:tcPr>
-            <w:tcW w:type="dxa" w:w="4392"/>
+            <w:tcW w:type="dxa" w:w="2736"/>
+            <w:vAlign w:val="center"/>
+          </w:tcPr>
+          <w:p>
+            <w:pPr>
+              <w:spacing w:before="0" w:after="0" w:line="240" w:lineRule="auto"/>
+            </w:pPr>
+            <w:r>
+              <w:rPr>
+                <w:b w:val="0"/>
+                <w:sz w:val="16"/>
+              </w:rPr>
+              <w:t>Predictability :The interface will behave in such a manner that the user can accurately predict what will happen next</w:t>
+            </w:r>
+          </w:p>
+        </w:tc>
+        <w:tc>
+          <w:tcPr>
+            <w:tcW w:type="dxa" w:w="3528"/>
             <w:vAlign w:val="center"/>
           </w:tcPr>
           <w:p>
@@ -4816,7 +4795,7 @@
         </w:tc>
         <w:tc>
           <w:tcPr>
-            <w:tcW w:type="dxa" w:w="792"/>
+            <w:tcW w:type="dxa" w:w="1080"/>
             <w:vAlign w:val="center"/>
           </w:tcPr>
           <w:p>
@@ -4835,7 +4814,7 @@
         </w:tc>
         <w:tc>
           <w:tcPr>
-            <w:tcW w:type="dxa" w:w="3024"/>
+            <w:tcW w:type="dxa" w:w="2405"/>
             <w:vAlign w:val="center"/>
           </w:tcPr>
           <w:p>
@@ -4855,7 +4834,7 @@
       <w:tr>
         <w:tc>
           <w:tcPr>
-            <w:tcW w:type="dxa" w:w="461"/>
+            <w:tcW w:type="dxa" w:w="576"/>
             <w:vAlign w:val="center"/>
           </w:tcPr>
           <w:p>
@@ -4874,25 +4853,25 @@
         </w:tc>
         <w:tc>
           <w:tcPr>
-            <w:tcW w:type="dxa" w:w="1656"/>
-            <w:vAlign w:val="center"/>
-          </w:tcPr>
-          <w:p>
-            <w:pPr>
-              <w:spacing w:before="0" w:after="0" w:line="240" w:lineRule="auto"/>
-            </w:pPr>
-            <w:r>
-              <w:rPr>
-                <w:b w:val="0"/>
-                <w:sz w:val="16"/>
-              </w:rPr>
-              <w:t>Accuracy</w:t>
-            </w:r>
-          </w:p>
-        </w:tc>
-        <w:tc>
-          <w:tcPr>
-            <w:tcW w:type="dxa" w:w="4392"/>
+            <w:tcW w:type="dxa" w:w="2736"/>
+            <w:vAlign w:val="center"/>
+          </w:tcPr>
+          <w:p>
+            <w:pPr>
+              <w:spacing w:before="0" w:after="0" w:line="240" w:lineRule="auto"/>
+            </w:pPr>
+            <w:r>
+              <w:rPr>
+                <w:b w:val="0"/>
+                <w:sz w:val="16"/>
+              </w:rPr>
+              <w:t>Accuracy: Interface will be free from errors</w:t>
+            </w:r>
+          </w:p>
+        </w:tc>
+        <w:tc>
+          <w:tcPr>
+            <w:tcW w:type="dxa" w:w="3528"/>
             <w:vAlign w:val="center"/>
           </w:tcPr>
           <w:p>
@@ -4910,7 +4889,7 @@
         </w:tc>
         <w:tc>
           <w:tcPr>
-            <w:tcW w:type="dxa" w:w="792"/>
+            <w:tcW w:type="dxa" w:w="1080"/>
             <w:vAlign w:val="center"/>
           </w:tcPr>
           <w:p>
@@ -4929,7 +4908,7 @@
         </w:tc>
         <w:tc>
           <w:tcPr>
-            <w:tcW w:type="dxa" w:w="3024"/>
+            <w:tcW w:type="dxa" w:w="2405"/>
             <w:vAlign w:val="center"/>
           </w:tcPr>
           <w:p>
@@ -4949,7 +4928,7 @@
       <w:tr>
         <w:tc>
           <w:tcPr>
-            <w:tcW w:type="dxa" w:w="461"/>
+            <w:tcW w:type="dxa" w:w="576"/>
             <w:vAlign w:val="center"/>
           </w:tcPr>
           <w:p>
@@ -4968,25 +4947,25 @@
         </w:tc>
         <w:tc>
           <w:tcPr>
-            <w:tcW w:type="dxa" w:w="1656"/>
-            <w:vAlign w:val="center"/>
-          </w:tcPr>
-          <w:p>
-            <w:pPr>
-              <w:spacing w:before="0" w:after="0" w:line="240" w:lineRule="auto"/>
-            </w:pPr>
-            <w:r>
-              <w:rPr>
-                <w:b w:val="0"/>
-                <w:sz w:val="16"/>
-              </w:rPr>
-              <w:t>Technical Clarity</w:t>
-            </w:r>
-          </w:p>
-        </w:tc>
-        <w:tc>
-          <w:tcPr>
-            <w:tcW w:type="dxa" w:w="4392"/>
+            <w:tcW w:type="dxa" w:w="2736"/>
+            <w:vAlign w:val="center"/>
+          </w:tcPr>
+          <w:p>
+            <w:pPr>
+              <w:spacing w:before="0" w:after="0" w:line="240" w:lineRule="auto"/>
+            </w:pPr>
+            <w:r>
+              <w:rPr>
+                <w:b w:val="0"/>
+                <w:sz w:val="16"/>
+              </w:rPr>
+              <w:t>Technical Clarity: Interface will have the highest possible fidelity.</w:t>
+            </w:r>
+          </w:p>
+        </w:tc>
+        <w:tc>
+          <w:tcPr>
+            <w:tcW w:type="dxa" w:w="3528"/>
             <w:vAlign w:val="center"/>
           </w:tcPr>
           <w:p>
@@ -5004,7 +4983,7 @@
         </w:tc>
         <w:tc>
           <w:tcPr>
-            <w:tcW w:type="dxa" w:w="792"/>
+            <w:tcW w:type="dxa" w:w="1080"/>
             <w:vAlign w:val="center"/>
           </w:tcPr>
           <w:p>
@@ -5023,7 +5002,7 @@
         </w:tc>
         <w:tc>
           <w:tcPr>
-            <w:tcW w:type="dxa" w:w="3024"/>
+            <w:tcW w:type="dxa" w:w="2405"/>
             <w:vAlign w:val="center"/>
           </w:tcPr>
           <w:p>
@@ -5043,7 +5022,7 @@
       <w:tr>
         <w:tc>
           <w:tcPr>
-            <w:tcW w:type="dxa" w:w="461"/>
+            <w:tcW w:type="dxa" w:w="576"/>
             <w:vAlign w:val="center"/>
           </w:tcPr>
           <w:p>
@@ -5062,25 +5041,25 @@
         </w:tc>
         <w:tc>
           <w:tcPr>
-            <w:tcW w:type="dxa" w:w="1656"/>
-            <w:vAlign w:val="center"/>
-          </w:tcPr>
-          <w:p>
-            <w:pPr>
-              <w:spacing w:before="0" w:after="0" w:line="240" w:lineRule="auto"/>
-            </w:pPr>
-            <w:r>
-              <w:rPr>
-                <w:b w:val="0"/>
-                <w:sz w:val="16"/>
-              </w:rPr>
-              <w:t>Fulfillment</w:t>
-            </w:r>
-          </w:p>
-        </w:tc>
-        <w:tc>
-          <w:tcPr>
-            <w:tcW w:type="dxa" w:w="4392"/>
+            <w:tcW w:type="dxa" w:w="2736"/>
+            <w:vAlign w:val="center"/>
+          </w:tcPr>
+          <w:p>
+            <w:pPr>
+              <w:spacing w:before="0" w:after="0" w:line="240" w:lineRule="auto"/>
+            </w:pPr>
+            <w:r>
+              <w:rPr>
+                <w:b w:val="0"/>
+                <w:sz w:val="16"/>
+              </w:rPr>
+              <w:t>Fulfillment : The interface will provide a satisfying user experience</w:t>
+            </w:r>
+          </w:p>
+        </w:tc>
+        <w:tc>
+          <w:tcPr>
+            <w:tcW w:type="dxa" w:w="3528"/>
             <w:vAlign w:val="center"/>
           </w:tcPr>
           <w:p>
@@ -5098,7 +5077,7 @@
         </w:tc>
         <w:tc>
           <w:tcPr>
-            <w:tcW w:type="dxa" w:w="792"/>
+            <w:tcW w:type="dxa" w:w="1080"/>
             <w:vAlign w:val="center"/>
           </w:tcPr>
           <w:p>
@@ -5117,7 +5096,7 @@
         </w:tc>
         <w:tc>
           <w:tcPr>
-            <w:tcW w:type="dxa" w:w="3024"/>
+            <w:tcW w:type="dxa" w:w="2405"/>
             <w:vAlign w:val="center"/>
           </w:tcPr>
           <w:p>
@@ -5137,7 +5116,7 @@
       <w:tr>
         <w:tc>
           <w:tcPr>
-            <w:tcW w:type="dxa" w:w="461"/>
+            <w:tcW w:type="dxa" w:w="576"/>
             <w:vAlign w:val="center"/>
           </w:tcPr>
           <w:p>
@@ -5156,25 +5135,25 @@
         </w:tc>
         <w:tc>
           <w:tcPr>
-            <w:tcW w:type="dxa" w:w="1656"/>
-            <w:vAlign w:val="center"/>
-          </w:tcPr>
-          <w:p>
-            <w:pPr>
-              <w:spacing w:before="0" w:after="0" w:line="240" w:lineRule="auto"/>
-            </w:pPr>
-            <w:r>
-              <w:rPr>
-                <w:b w:val="0"/>
-                <w:sz w:val="16"/>
-              </w:rPr>
-              <w:t>Consistency</w:t>
-            </w:r>
-          </w:p>
-        </w:tc>
-        <w:tc>
-          <w:tcPr>
-            <w:tcW w:type="dxa" w:w="4392"/>
+            <w:tcW w:type="dxa" w:w="2736"/>
+            <w:vAlign w:val="center"/>
+          </w:tcPr>
+          <w:p>
+            <w:pPr>
+              <w:spacing w:before="0" w:after="0" w:line="240" w:lineRule="auto"/>
+            </w:pPr>
+            <w:r>
+              <w:rPr>
+                <w:b w:val="0"/>
+                <w:sz w:val="16"/>
+              </w:rPr>
+              <w:t>Consistency: Interface will be consistent</w:t>
+            </w:r>
+          </w:p>
+        </w:tc>
+        <w:tc>
+          <w:tcPr>
+            <w:tcW w:type="dxa" w:w="3528"/>
             <w:vAlign w:val="center"/>
           </w:tcPr>
           <w:p>
@@ -5192,7 +5171,7 @@
         </w:tc>
         <w:tc>
           <w:tcPr>
-            <w:tcW w:type="dxa" w:w="792"/>
+            <w:tcW w:type="dxa" w:w="1080"/>
             <w:vAlign w:val="center"/>
           </w:tcPr>
           <w:p>
@@ -5211,7 +5190,7 @@
         </w:tc>
         <w:tc>
           <w:tcPr>
-            <w:tcW w:type="dxa" w:w="3024"/>
+            <w:tcW w:type="dxa" w:w="2405"/>
             <w:vAlign w:val="center"/>
           </w:tcPr>
           <w:p>
@@ -5231,7 +5210,7 @@
       <w:tr>
         <w:tc>
           <w:tcPr>
-            <w:tcW w:type="dxa" w:w="461"/>
+            <w:tcW w:type="dxa" w:w="576"/>
             <w:vAlign w:val="center"/>
           </w:tcPr>
           <w:p>
@@ -5250,25 +5229,25 @@
         </w:tc>
         <w:tc>
           <w:tcPr>
-            <w:tcW w:type="dxa" w:w="1656"/>
-            <w:vAlign w:val="center"/>
-          </w:tcPr>
-          <w:p>
-            <w:pPr>
-              <w:spacing w:before="0" w:after="0" w:line="240" w:lineRule="auto"/>
-            </w:pPr>
-            <w:r>
-              <w:rPr>
-                <w:b w:val="0"/>
-                <w:sz w:val="16"/>
-              </w:rPr>
-              <w:t>User Support</w:t>
-            </w:r>
-          </w:p>
-        </w:tc>
-        <w:tc>
-          <w:tcPr>
-            <w:tcW w:type="dxa" w:w="4392"/>
+            <w:tcW w:type="dxa" w:w="2736"/>
+            <w:vAlign w:val="center"/>
+          </w:tcPr>
+          <w:p>
+            <w:pPr>
+              <w:spacing w:before="0" w:after="0" w:line="240" w:lineRule="auto"/>
+            </w:pPr>
+            <w:r>
+              <w:rPr>
+                <w:b w:val="0"/>
+                <w:sz w:val="16"/>
+              </w:rPr>
+              <w:t>User Support: Interface will provide additional assistance as needed or requested</w:t>
+            </w:r>
+          </w:p>
+        </w:tc>
+        <w:tc>
+          <w:tcPr>
+            <w:tcW w:type="dxa" w:w="3528"/>
             <w:vAlign w:val="center"/>
           </w:tcPr>
           <w:p>
@@ -5286,7 +5265,7 @@
         </w:tc>
         <w:tc>
           <w:tcPr>
-            <w:tcW w:type="dxa" w:w="792"/>
+            <w:tcW w:type="dxa" w:w="1080"/>
             <w:vAlign w:val="center"/>
           </w:tcPr>
           <w:p>
@@ -5305,7 +5284,7 @@
         </w:tc>
         <w:tc>
           <w:tcPr>
-            <w:tcW w:type="dxa" w:w="3024"/>
+            <w:tcW w:type="dxa" w:w="2405"/>
             <w:vAlign w:val="center"/>
           </w:tcPr>
           <w:p>
@@ -5325,7 +5304,7 @@
       <w:tr>
         <w:tc>
           <w:tcPr>
-            <w:tcW w:type="dxa" w:w="461"/>
+            <w:tcW w:type="dxa" w:w="576"/>
             <w:vAlign w:val="center"/>
           </w:tcPr>
           <w:p>
@@ -5344,25 +5323,25 @@
         </w:tc>
         <w:tc>
           <w:tcPr>
-            <w:tcW w:type="dxa" w:w="1656"/>
-            <w:vAlign w:val="center"/>
-          </w:tcPr>
-          <w:p>
-            <w:pPr>
-              <w:spacing w:before="0" w:after="0" w:line="240" w:lineRule="auto"/>
-            </w:pPr>
-            <w:r>
-              <w:rPr>
-                <w:b w:val="0"/>
-                <w:sz w:val="16"/>
-              </w:rPr>
-              <w:t>Precision</w:t>
-            </w:r>
-          </w:p>
-        </w:tc>
-        <w:tc>
-          <w:tcPr>
-            <w:tcW w:type="dxa" w:w="4392"/>
+            <w:tcW w:type="dxa" w:w="2736"/>
+            <w:vAlign w:val="center"/>
+          </w:tcPr>
+          <w:p>
+            <w:pPr>
+              <w:spacing w:before="0" w:after="0" w:line="240" w:lineRule="auto"/>
+            </w:pPr>
+            <w:r>
+              <w:rPr>
+                <w:b w:val="0"/>
+                <w:sz w:val="16"/>
+              </w:rPr>
+              <w:t>Precision: The interface will allow the users to perform a task exactly</w:t>
+            </w:r>
+          </w:p>
+        </w:tc>
+        <w:tc>
+          <w:tcPr>
+            <w:tcW w:type="dxa" w:w="3528"/>
             <w:vAlign w:val="center"/>
           </w:tcPr>
           <w:p>
@@ -5380,7 +5359,7 @@
         </w:tc>
         <w:tc>
           <w:tcPr>
-            <w:tcW w:type="dxa" w:w="792"/>
+            <w:tcW w:type="dxa" w:w="1080"/>
             <w:vAlign w:val="center"/>
           </w:tcPr>
           <w:p>
@@ -5399,7 +5378,7 @@
         </w:tc>
         <w:tc>
           <w:tcPr>
-            <w:tcW w:type="dxa" w:w="3024"/>
+            <w:tcW w:type="dxa" w:w="2405"/>
             <w:vAlign w:val="center"/>
           </w:tcPr>
           <w:p>
@@ -5419,7 +5398,7 @@
       <w:tr>
         <w:tc>
           <w:tcPr>
-            <w:tcW w:type="dxa" w:w="461"/>
+            <w:tcW w:type="dxa" w:w="576"/>
             <w:vAlign w:val="center"/>
           </w:tcPr>
           <w:p>
@@ -5438,25 +5417,25 @@
         </w:tc>
         <w:tc>
           <w:tcPr>
-            <w:tcW w:type="dxa" w:w="1656"/>
-            <w:vAlign w:val="center"/>
-          </w:tcPr>
-          <w:p>
-            <w:pPr>
-              <w:spacing w:before="0" w:after="0" w:line="240" w:lineRule="auto"/>
-            </w:pPr>
-            <w:r>
-              <w:rPr>
-                <w:b w:val="0"/>
-                <w:sz w:val="16"/>
-              </w:rPr>
-              <w:t>Forgiveness</w:t>
-            </w:r>
-          </w:p>
-        </w:tc>
-        <w:tc>
-          <w:tcPr>
-            <w:tcW w:type="dxa" w:w="4392"/>
+            <w:tcW w:type="dxa" w:w="2736"/>
+            <w:vAlign w:val="center"/>
+          </w:tcPr>
+          <w:p>
+            <w:pPr>
+              <w:spacing w:before="0" w:after="0" w:line="240" w:lineRule="auto"/>
+            </w:pPr>
+            <w:r>
+              <w:rPr>
+                <w:b w:val="0"/>
+                <w:sz w:val="16"/>
+              </w:rPr>
+              <w:t>Forgiveness: Interface will make action recoverable</w:t>
+            </w:r>
+          </w:p>
+        </w:tc>
+        <w:tc>
+          <w:tcPr>
+            <w:tcW w:type="dxa" w:w="3528"/>
             <w:vAlign w:val="center"/>
           </w:tcPr>
           <w:p>
@@ -5474,7 +5453,7 @@
         </w:tc>
         <w:tc>
           <w:tcPr>
-            <w:tcW w:type="dxa" w:w="792"/>
+            <w:tcW w:type="dxa" w:w="1080"/>
             <w:vAlign w:val="center"/>
           </w:tcPr>
           <w:p>
@@ -5493,7 +5472,7 @@
         </w:tc>
         <w:tc>
           <w:tcPr>
-            <w:tcW w:type="dxa" w:w="3024"/>
+            <w:tcW w:type="dxa" w:w="2405"/>
             <w:vAlign w:val="center"/>
           </w:tcPr>
           <w:p>
@@ -5513,7 +5492,7 @@
       <w:tr>
         <w:tc>
           <w:tcPr>
-            <w:tcW w:type="dxa" w:w="461"/>
+            <w:tcW w:type="dxa" w:w="576"/>
             <w:vAlign w:val="center"/>
           </w:tcPr>
           <w:p>
@@ -5532,25 +5511,25 @@
         </w:tc>
         <w:tc>
           <w:tcPr>
-            <w:tcW w:type="dxa" w:w="1656"/>
-            <w:vAlign w:val="center"/>
-          </w:tcPr>
-          <w:p>
-            <w:pPr>
-              <w:spacing w:before="0" w:after="0" w:line="240" w:lineRule="auto"/>
-            </w:pPr>
-            <w:r>
-              <w:rPr>
-                <w:b w:val="0"/>
-                <w:sz w:val="16"/>
-              </w:rPr>
-              <w:t>Responsiveness</w:t>
-            </w:r>
-          </w:p>
-        </w:tc>
-        <w:tc>
-          <w:tcPr>
-            <w:tcW w:type="dxa" w:w="4392"/>
+            <w:tcW w:type="dxa" w:w="2736"/>
+            <w:vAlign w:val="center"/>
+          </w:tcPr>
+          <w:p>
+            <w:pPr>
+              <w:spacing w:before="0" w:after="0" w:line="240" w:lineRule="auto"/>
+            </w:pPr>
+            <w:r>
+              <w:rPr>
+                <w:b w:val="0"/>
+                <w:sz w:val="16"/>
+              </w:rPr>
+              <w:t>Responsiveness: The interface will inform users about the results of their actions and their interface status</w:t>
+            </w:r>
+          </w:p>
+        </w:tc>
+        <w:tc>
+          <w:tcPr>
+            <w:tcW w:type="dxa" w:w="3528"/>
             <w:vAlign w:val="center"/>
           </w:tcPr>
           <w:p>
@@ -5568,7 +5547,7 @@
         </w:tc>
         <w:tc>
           <w:tcPr>
-            <w:tcW w:type="dxa" w:w="792"/>
+            <w:tcW w:type="dxa" w:w="1080"/>
             <w:vAlign w:val="center"/>
           </w:tcPr>
           <w:p>
@@ -5587,7 +5566,7 @@
         </w:tc>
         <w:tc>
           <w:tcPr>
-            <w:tcW w:type="dxa" w:w="3024"/>
+            <w:tcW w:type="dxa" w:w="2405"/>
             <w:vAlign w:val="center"/>
           </w:tcPr>
           <w:p>
@@ -5607,25 +5586,25 @@
       <w:tr>
         <w:tc>
           <w:tcPr>
-            <w:tcW w:type="dxa" w:w="461"/>
-            <w:vAlign w:val="center"/>
-          </w:tcPr>
-          <w:p>
-            <w:pPr>
-              <w:spacing w:before="0" w:after="0" w:line="240" w:lineRule="auto"/>
-              <w:jc w:val="center"/>
-            </w:pPr>
-            <w:r>
-              <w:rPr>
-                <w:b/>
-                <w:sz w:val="16"/>
-              </w:rPr>
-            </w:r>
-          </w:p>
-        </w:tc>
-        <w:tc>
-          <w:tcPr>
-            <w:tcW w:type="dxa" w:w="1656"/>
+            <w:tcW w:type="dxa" w:w="576"/>
+            <w:vAlign w:val="center"/>
+          </w:tcPr>
+          <w:p>
+            <w:pPr>
+              <w:spacing w:before="0" w:after="0" w:line="240" w:lineRule="auto"/>
+              <w:jc w:val="center"/>
+            </w:pPr>
+            <w:r>
+              <w:rPr>
+                <w:b/>
+                <w:sz w:val="16"/>
+              </w:rPr>
+            </w:r>
+          </w:p>
+        </w:tc>
+        <w:tc>
+          <w:tcPr>
+            <w:tcW w:type="dxa" w:w="2736"/>
             <w:vAlign w:val="center"/>
           </w:tcPr>
           <w:p>
@@ -5643,24 +5622,24 @@
         </w:tc>
         <w:tc>
           <w:tcPr>
-            <w:tcW w:type="dxa" w:w="4392"/>
-            <w:vAlign w:val="center"/>
-          </w:tcPr>
-          <w:p>
-            <w:pPr>
-              <w:spacing w:before="0" w:after="0" w:line="240" w:lineRule="auto"/>
-            </w:pPr>
-            <w:r>
-              <w:rPr>
-                <w:b/>
-                <w:sz w:val="16"/>
-              </w:rPr>
-            </w:r>
-          </w:p>
-        </w:tc>
-        <w:tc>
-          <w:tcPr>
-            <w:tcW w:type="dxa" w:w="792"/>
+            <w:tcW w:type="dxa" w:w="3528"/>
+            <w:vAlign w:val="center"/>
+          </w:tcPr>
+          <w:p>
+            <w:pPr>
+              <w:spacing w:before="0" w:after="0" w:line="240" w:lineRule="auto"/>
+            </w:pPr>
+            <w:r>
+              <w:rPr>
+                <w:b/>
+                <w:sz w:val="16"/>
+              </w:rPr>
+            </w:r>
+          </w:p>
+        </w:tc>
+        <w:tc>
+          <w:tcPr>
+            <w:tcW w:type="dxa" w:w="1080"/>
             <w:vAlign w:val="center"/>
           </w:tcPr>
           <w:p>
@@ -5679,7 +5658,7 @@
         </w:tc>
         <w:tc>
           <w:tcPr>
-            <w:tcW w:type="dxa" w:w="3024"/>
+            <w:tcW w:type="dxa" w:w="2405"/>
             <w:vAlign w:val="center"/>
           </w:tcPr>
           <w:p>
@@ -5733,19 +5712,18 @@
           <w:tcPr>
             <w:tcW w:type="dxa" w:w="576"/>
             <w:vAlign w:val="center"/>
-            <w:shd w:val="clear" w:color="auto" w:fill="D9E2DC"/>
-          </w:tcPr>
-          <w:p>
-            <w:pPr>
-              <w:spacing w:before="0" w:after="0" w:line="240" w:lineRule="auto"/>
-              <w:jc w:val="center"/>
-            </w:pPr>
-            <w:r>
-              <w:rPr>
-                <w:b/>
-                <w:sz w:val="16"/>
-              </w:rPr>
-              <w:t>No.</w:t>
+          </w:tcPr>
+          <w:p>
+            <w:pPr>
+              <w:spacing w:before="0" w:after="0" w:line="240" w:lineRule="auto"/>
+              <w:jc w:val="center"/>
+            </w:pPr>
+            <w:r>
+              <w:rPr>
+                <w:b/>
+                <w:sz w:val="16"/>
+              </w:rPr>
+              <w:t>S.NO</w:t>
             </w:r>
           </w:p>
         </w:tc>
@@ -5753,18 +5731,17 @@
           <w:tcPr>
             <w:tcW w:type="dxa" w:w="5112"/>
             <w:vAlign w:val="center"/>
-            <w:shd w:val="clear" w:color="auto" w:fill="D9E2DC"/>
-          </w:tcPr>
-          <w:p>
-            <w:pPr>
-              <w:spacing w:before="0" w:after="0" w:line="240" w:lineRule="auto"/>
-            </w:pPr>
-            <w:r>
-              <w:rPr>
-                <w:b/>
-                <w:sz w:val="16"/>
-              </w:rPr>
-              <w:t>Observations</w:t>
+          </w:tcPr>
+          <w:p>
+            <w:pPr>
+              <w:spacing w:before="0" w:after="0" w:line="240" w:lineRule="auto"/>
+            </w:pPr>
+            <w:r>
+              <w:rPr>
+                <w:b/>
+                <w:sz w:val="16"/>
+              </w:rPr>
+              <w:t>OBSERVATIONS</w:t>
             </w:r>
           </w:p>
         </w:tc>
@@ -5772,18 +5749,17 @@
           <w:tcPr>
             <w:tcW w:type="dxa" w:w="4637"/>
             <w:vAlign w:val="center"/>
-            <w:shd w:val="clear" w:color="auto" w:fill="D9E2DC"/>
-          </w:tcPr>
-          <w:p>
-            <w:pPr>
-              <w:spacing w:before="0" w:after="0" w:line="240" w:lineRule="auto"/>
-            </w:pPr>
-            <w:r>
-              <w:rPr>
-                <w:b/>
-                <w:sz w:val="16"/>
-              </w:rPr>
-              <w:t>Comments</w:t>
+          </w:tcPr>
+          <w:p>
+            <w:pPr>
+              <w:spacing w:before="0" w:after="0" w:line="240" w:lineRule="auto"/>
+            </w:pPr>
+            <w:r>
+              <w:rPr>
+                <w:b/>
+                <w:sz w:val="16"/>
+              </w:rPr>
+              <w:t>COMMENTS</w:t>
             </w:r>
           </w:p>
         </w:tc>
@@ -6054,7 +6030,6 @@
           <w:tcPr>
             <w:tcW w:type="dxa" w:w="576"/>
             <w:vAlign w:val="center"/>
-            <w:shd w:val="clear" w:color="auto" w:fill="D9E2DC"/>
           </w:tcPr>
           <w:p>
             <w:pPr>
@@ -6074,7 +6049,6 @@
           <w:tcPr>
             <w:tcW w:type="dxa" w:w="4320"/>
             <w:vAlign w:val="center"/>
-            <w:shd w:val="clear" w:color="auto" w:fill="D9E2DC"/>
           </w:tcPr>
           <w:p>
             <w:pPr>
@@ -6093,7 +6067,6 @@
           <w:tcPr>
             <w:tcW w:type="dxa" w:w="2160"/>
             <w:vAlign w:val="center"/>
-            <w:shd w:val="clear" w:color="auto" w:fill="D9E2DC"/>
           </w:tcPr>
           <w:p>
             <w:pPr>

</xml_diff>

<commit_message>
update severity scores for each user
</commit_message>
<xml_diff>
--- a/experiment5_1032232006_amey_tarmale_99acres.docx
+++ b/experiment5_1032232006_amey_tarmale_99acres.docx
@@ -314,7 +314,7 @@
                 <w:b/>
                 <w:sz w:val="16"/>
               </w:rPr>
-              <w:t>3</w:t>
+              <w:t>4</w:t>
             </w:r>
           </w:p>
         </w:tc>
@@ -408,7 +408,7 @@
                 <w:b/>
                 <w:sz w:val="16"/>
               </w:rPr>
-              <w:t>1</w:t>
+              <w:t>2</w:t>
             </w:r>
           </w:p>
         </w:tc>
@@ -502,7 +502,7 @@
                 <w:b/>
                 <w:sz w:val="16"/>
               </w:rPr>
-              <w:t>2</w:t>
+              <w:t>3</w:t>
             </w:r>
           </w:p>
         </w:tc>
@@ -596,7 +596,7 @@
                 <w:b/>
                 <w:sz w:val="16"/>
               </w:rPr>
-              <w:t>2</w:t>
+              <w:t>3</w:t>
             </w:r>
           </w:p>
         </w:tc>
@@ -784,7 +784,7 @@
                 <w:b/>
                 <w:sz w:val="16"/>
               </w:rPr>
-              <w:t>0</w:t>
+              <w:t>1</w:t>
             </w:r>
           </w:p>
         </w:tc>
@@ -878,7 +878,7 @@
                 <w:b/>
                 <w:sz w:val="16"/>
               </w:rPr>
-              <w:t>3</w:t>
+              <w:t>4</w:t>
             </w:r>
           </w:p>
         </w:tc>
@@ -1066,7 +1066,7 @@
                 <w:b/>
                 <w:sz w:val="16"/>
               </w:rPr>
-              <w:t>1</w:t>
+              <w:t>2</w:t>
             </w:r>
           </w:p>
         </w:tc>
@@ -1160,7 +1160,7 @@
                 <w:b/>
                 <w:sz w:val="16"/>
               </w:rPr>
-              <w:t>2</w:t>
+              <w:t>3</w:t>
             </w:r>
           </w:p>
         </w:tc>
@@ -1348,7 +1348,7 @@
                 <w:b/>
                 <w:sz w:val="16"/>
               </w:rPr>
-              <w:t>2</w:t>
+              <w:t>3</w:t>
             </w:r>
           </w:p>
         </w:tc>
@@ -1442,7 +1442,7 @@
                 <w:b/>
                 <w:sz w:val="16"/>
               </w:rPr>
-              <w:t>2</w:t>
+              <w:t>3</w:t>
             </w:r>
           </w:p>
         </w:tc>
@@ -1722,7 +1722,7 @@
                 <w:b/>
                 <w:sz w:val="16"/>
               </w:rPr>
-              <w:t>28 / 75</w:t>
+              <w:t>38 / 75</w:t>
             </w:r>
           </w:p>
         </w:tc>
@@ -2279,7 +2279,7 @@
                 <w:b/>
                 <w:sz w:val="16"/>
               </w:rPr>
-              <w:t>2</w:t>
+              <w:t>3</w:t>
             </w:r>
           </w:p>
         </w:tc>
@@ -2373,7 +2373,7 @@
                 <w:b/>
                 <w:sz w:val="16"/>
               </w:rPr>
-              <w:t>1</w:t>
+              <w:t>2</w:t>
             </w:r>
           </w:p>
         </w:tc>
@@ -2467,7 +2467,7 @@
                 <w:b/>
                 <w:sz w:val="16"/>
               </w:rPr>
-              <w:t>3</w:t>
+              <w:t>4</w:t>
             </w:r>
           </w:p>
         </w:tc>
@@ -2655,7 +2655,7 @@
                 <w:b/>
                 <w:sz w:val="16"/>
               </w:rPr>
-              <w:t>1</w:t>
+              <w:t>2</w:t>
             </w:r>
           </w:p>
         </w:tc>
@@ -2749,7 +2749,7 @@
                 <w:b/>
                 <w:sz w:val="16"/>
               </w:rPr>
-              <w:t>0</w:t>
+              <w:t>1</w:t>
             </w:r>
           </w:p>
         </w:tc>
@@ -3219,7 +3219,7 @@
                 <w:b/>
                 <w:sz w:val="16"/>
               </w:rPr>
-              <w:t>2</w:t>
+              <w:t>3</w:t>
             </w:r>
           </w:p>
         </w:tc>
@@ -3313,7 +3313,7 @@
                 <w:b/>
                 <w:sz w:val="16"/>
               </w:rPr>
-              <w:t>2</w:t>
+              <w:t>3</w:t>
             </w:r>
           </w:p>
         </w:tc>
@@ -3501,7 +3501,7 @@
                 <w:b/>
                 <w:sz w:val="16"/>
               </w:rPr>
-              <w:t>2</w:t>
+              <w:t>3</w:t>
             </w:r>
           </w:p>
         </w:tc>
@@ -3687,7 +3687,7 @@
                 <w:b/>
                 <w:sz w:val="16"/>
               </w:rPr>
-              <w:t>26 / 75</w:t>
+              <w:t>34 / 75</w:t>
             </w:r>
           </w:p>
         </w:tc>
@@ -4338,7 +4338,7 @@
                 <w:b/>
                 <w:sz w:val="16"/>
               </w:rPr>
-              <w:t>0</w:t>
+              <w:t>1</w:t>
             </w:r>
           </w:p>
         </w:tc>
@@ -4526,7 +4526,7 @@
                 <w:b/>
                 <w:sz w:val="16"/>
               </w:rPr>
-              <w:t>1</w:t>
+              <w:t>2</w:t>
             </w:r>
           </w:p>
         </w:tc>
@@ -4808,7 +4808,7 @@
                 <w:b/>
                 <w:sz w:val="16"/>
               </w:rPr>
-              <w:t>3</w:t>
+              <w:t>4</w:t>
             </w:r>
           </w:p>
         </w:tc>
@@ -4902,7 +4902,7 @@
                 <w:b/>
                 <w:sz w:val="16"/>
               </w:rPr>
-              <w:t>3</w:t>
+              <w:t>4</w:t>
             </w:r>
           </w:p>
         </w:tc>
@@ -5184,7 +5184,7 @@
                 <w:b/>
                 <w:sz w:val="16"/>
               </w:rPr>
-              <w:t>1</w:t>
+              <w:t>2</w:t>
             </w:r>
           </w:p>
         </w:tc>
@@ -5466,7 +5466,7 @@
                 <w:b/>
                 <w:sz w:val="16"/>
               </w:rPr>
-              <w:t>2</w:t>
+              <w:t>3</w:t>
             </w:r>
           </w:p>
         </w:tc>
@@ -5652,7 +5652,7 @@
                 <w:b/>
                 <w:sz w:val="16"/>
               </w:rPr>
-              <w:t>26 / 75</w:t>
+              <w:t>32 / 75</w:t>
             </w:r>
           </w:p>
         </w:tc>
@@ -6134,7 +6134,7 @@
                 <w:b w:val="0"/>
                 <w:sz w:val="16"/>
               </w:rPr>
-              <w:t>28 / 75</w:t>
+              <w:t>38 / 75</w:t>
             </w:r>
           </w:p>
         </w:tc>
@@ -6191,7 +6191,7 @@
                 <w:b w:val="0"/>
                 <w:sz w:val="16"/>
               </w:rPr>
-              <w:t>26 / 75</w:t>
+              <w:t>34 / 75</w:t>
             </w:r>
           </w:p>
         </w:tc>
@@ -6248,7 +6248,7 @@
                 <w:b w:val="0"/>
                 <w:sz w:val="16"/>
               </w:rPr>
-              <w:t>26 / 75</w:t>
+              <w:t>32 / 75</w:t>
             </w:r>
           </w:p>
         </w:tc>
@@ -6304,7 +6304,7 @@
                 <w:b/>
                 <w:sz w:val="16"/>
               </w:rPr>
-              <w:t>26.7 / 75</w:t>
+              <w:t>34.7 / 75</w:t>
             </w:r>
           </w:p>
         </w:tc>

</xml_diff>